<commit_message>
Actualizacion de nuevo punto 3, en el contrato de gratificacion
</commit_message>
<xml_diff>
--- a/public/plantilla.docx
+++ b/public/plantilla.docx
@@ -2464,7 +2464,7 @@
           </mc:Choice>
           <mc:Fallback>
             <w:pict>
-              <v:shape w14:anchorId="432DD3F5" id="Textbox 7" o:spid="_x0000_s1031" type="#_x0000_t202" style="width:77.55pt;height:14.55pt;visibility:visible;mso-wrap-style:square;mso-left-percent:-10001;mso-top-percent:-10001;mso-position-horizontal:absolute;mso-position-horizontal-relative:char;mso-position-vertical:absolute;mso-position-vertical-relative:line;mso-left-percent:-10001;mso-top-percent:-10001;v-text-anchor:top" o:gfxdata="UEsDBBQABgAIAAAAIQC2gziS/gAAAOEBAAATAAAAW0NvbnRlbnRfVHlwZXNdLnhtbJSRQU7DMBBF 90jcwfIWJU67QAgl6YK0S0CoHGBkTxKLZGx5TGhvj5O2G0SRWNoz/78nu9wcxkFMGNg6quQqL6RA 0s5Y6ir5vt9lD1JwBDIwOMJKHpHlpr69KfdHjyxSmriSfYz+USnWPY7AufNIadK6MEJMx9ApD/oD OlTrorhX2lFEilmcO2RdNtjC5xDF9pCuTyYBB5bi6bQ4syoJ3g9WQ0ymaiLzg5KdCXlKLjvcW893 SUOqXwnz5DrgnHtJTxOsQfEKIT7DmDSUCaxw7Rqn8787ZsmRM9e2VmPeBN4uqYvTtW7jvijg9N/y JsXecLq0q+WD6m8AAAD//wMAUEsDBBQABgAIAAAAIQA4/SH/1gAAAJQBAAALAAAAX3JlbHMvLnJl bHOkkMFqwzAMhu+DvYPRfXGawxijTi+j0GvpHsDYimMaW0Yy2fr2M4PBMnrbUb/Q94l/f/hMi1qR JVI2sOt6UJgd+ZiDgffL8ekFlFSbvV0oo4EbChzGx4f9GRdb25HMsYhqlCwG5lrLq9biZkxWOiqY 22YiTra2kYMu1l1tQD30/bPm3wwYN0x18gb45AdQl1tp5j/sFB2T0FQ7R0nTNEV3j6o9feQzro1i OWA14Fm+Q8a1a8+Bvu/d/dMb2JY5uiPbhG/ktn4cqGU/er3pcvwCAAD//wMAUEsDBBQABgAIAAAA IQAAeM84xQEAAIUDAAAOAAAAZHJzL2Uyb0RvYy54bWysU8GO0zAQvSPxD5bvNG1ZIBs1XcFWi5BW LNLCBziO3Vg4HuNxm/TvGTtpu4IbIgdn4nl+nvdmsrkbe8uOKqABV/PVYsmZchJa4/Y1//H94U3J GUbhWmHBqZqfFPK77etXm8FXag0d2FYFRiQOq8HXvIvRV0WBslO9wAV45SipIfQi0mfYF20QA7H3 tlgvl++LAULrA0iFSLu7Kcm3mV9rJeOT1qgiszWn2mJeQ16btBbbjaj2QfjOyLkM8Q9V9MI4uvRC tRNRsEMwf1H1RgZA0HEhoS9AayNV1kBqVss/1Dx3wqushcxBf7EJ/x+t/Hp89t8Ci+MnGKmBWQT6 R5A/kbwpBo/VjEmeYoWETkJHHfr0JgmMDpK3p4ufaoxM0uZteVOW7ziTlFqVNx8oTpzXwz5g/Kyg ZymoeaB25QLE8RHjBD1D0l3WsYGY1m9Xt1OdYE37YKxNSQz75t4GdhSp1fmZb8OXsMS3E9hNuJya YdbNeieJSWwcm5GZtua58LTTQHsiuwaamJrjr4MIijP7xVFL0nidg3AOmnMQor2HPISpWAcfDxG0 ySKvvHMB1Ots0zyXaZhefmfU9e/Z/gYAAP//AwBQSwMEFAAGAAgAAAAhAN0crHjaAAAABAEAAA8A AABkcnMvZG93bnJldi54bWxMj8FOwzAQRO9I/IO1SFwq6qRSUQlxqgqpNw6l9AM28TaOaq9D7Cbh 73G5wGWl0Yxm3pbb2Vkx0hA6zwryZQaCuPG641bB6XP/tAERIrJG65kUfFOAbXV/V2Kh/cQfNB5j K1IJhwIVmBj7QsrQGHIYlr4nTt7ZDw5jkkMr9YBTKndWrrLsWTrsOC0Y7OnNUHM5Xp2C80S5octi 3uy/Du/1OO1sszgo9fgw715BRJrjXxhu+AkdqsRU+yvrIKyC9Ej8vTdvvc5B1ApWLznIqpT/4asf AAAA//8DAFBLAQItABQABgAIAAAAIQC2gziS/gAAAOEBAAATAAAAAAAAAAAAAAAAAAAAAABbQ29u dGVudF9UeXBlc10ueG1sUEsBAi0AFAAGAAgAAAAhADj9If/WAAAAlAEAAAsAAAAAAAAAAAAAAAAA LwEAAF9yZWxzLy5yZWxzUEsBAi0AFAAGAAgAAAAhAAB4zzjFAQAAhQMAAA4AAAAAAAAAAAAAAAAA LgIAAGRycy9lMm9Eb2MueG1sUEsBAi0AFAAGAAgAAAAhAN0crHjaAAAABAEAAA8AAAAAAAAAAAAA AAAAHwQAAGRycy9kb3ducmV2LnhtbFBLBQYAAAAABAAEAPMAAAAmBQAAAAA= " filled="f" strokeweight=".97pt">
+              <v:shape w14:anchorId="432DD3F5" id="Textbox 7" o:spid="_x0000_s1031" type="#_x0000_t202" style="width:77.55pt;height:14.55pt;visibility:visible;mso-wrap-style:square;mso-left-percent:-10001;mso-top-percent:-10001;mso-position-horizontal:absolute;mso-position-horizontal-relative:char;mso-position-vertical:absolute;mso-position-vertical-relative:line;mso-left-percent:-10001;mso-top-percent:-10001;v-text-anchor:top" o:gfxdata="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" filled="f" strokeweight=".97pt">
                 <v:path arrowok="t"/>
                 <v:textbox inset="0,0,0,0">
                   <w:txbxContent>
@@ -4442,8 +4442,8 @@
           </mc:Choice>
           <mc:Fallback>
             <w:pict>
-              <v:group w14:anchorId="4A7B37FD" id="Grupo 11" o:spid="_x0000_s1032" style="position:absolute;margin-left:68.4pt;margin-top:80.5pt;width:225.3pt;height:44pt;z-index:487613440;mso-position-horizontal-relative:page;mso-position-vertical-relative:text;mso-height-relative:margin" coordsize="28613,5598" o:gfxdata="UEsDBBQABgAIAAAAIQC2gziS/gAAAOEBAAATAAAAW0NvbnRlbnRfVHlwZXNdLnhtbJSRQU7DMBBF 90jcwfIWJU67QAgl6YK0S0CoHGBkTxKLZGx5TGhvj5O2G0SRWNoz/78nu9wcxkFMGNg6quQqL6RA 0s5Y6ir5vt9lD1JwBDIwOMJKHpHlpr69KfdHjyxSmriSfYz+USnWPY7AufNIadK6MEJMx9ApD/oD OlTrorhX2lFEilmcO2RdNtjC5xDF9pCuTyYBB5bi6bQ4syoJ3g9WQ0ymaiLzg5KdCXlKLjvcW893 SUOqXwnz5DrgnHtJTxOsQfEKIT7DmDSUCaxw7Rqn8787ZsmRM9e2VmPeBN4uqYvTtW7jvijg9N/y JsXecLq0q+WD6m8AAAD//wMAUEsDBBQABgAIAAAAIQA4/SH/1gAAAJQBAAALAAAAX3JlbHMvLnJl bHOkkMFqwzAMhu+DvYPRfXGawxijTi+j0GvpHsDYimMaW0Yy2fr2M4PBMnrbUb/Q94l/f/hMi1qR JVI2sOt6UJgd+ZiDgffL8ekFlFSbvV0oo4EbChzGx4f9GRdb25HMsYhqlCwG5lrLq9biZkxWOiqY 22YiTra2kYMu1l1tQD30/bPm3wwYN0x18gb45AdQl1tp5j/sFB2T0FQ7R0nTNEV3j6o9feQzro1i OWA14Fm+Q8a1a8+Bvu/d/dMb2JY5uiPbhG/ktn4cqGU/er3pcvwCAAD//wMAUEsDBBQABgAIAAAA IQBR3iOXKAMAAL4HAAAOAAAAZHJzL2Uyb0RvYy54bWy0Vdly2yAUfe9M/4HhvZElS140kTOpE2c6 0yXTtB+AEVqmCFTAlt2v7wVtduI+NJ3qQQLBPdx7OAeubw4VR3umdClFgv2rCUZMUJmWIk/w92+b dwuMtCEiJVwKluAj0/hm9fbNdVPHLJCF5ClTCECEjps6wYUxdex5mhasIvpK1kzAYCZVRQx0Ve6l ijSAXnEvmExmXiNVWitJmdbw964dxCuHn2WMmi9ZpplBPMGQm3Fv5d5b+/ZW1yTOFamLknZpkFdk UZFSwKID1B0xBO1U+QKqKqmSWmbmisrKk1lWUuZqgGr8ybNqHpTc1a6WPG7yeqAJqH3G06th6ef9 g6qf6kcFTDR1Dly4nq3lkKnKfiFLdHCUHQfK2MEgCj+Dxcyf+sAshbEoWiwmHae0AOJfhNHi/jRw Ou8Dl4u5bzfD65f1zpJpapCHHhnQ/8bAU0Fq5ojVMTDwqFCZQi2+P11GYRRBVoJUoNb1jqRKopQh AwVLFNgUbS4QZDlD5vBeAgu+23tdf5T0h0ZCrgsicnarlGwKRlLIti3uJLTF0RZk23ySKaxGdkY6 oIvET5fzIGr1OpIfRuHM7zgEAYWzMw5JXCttHpiskG0kWIEf3Apk/1Gblu5+it1pLXmZbkrOXUfl 2zVXaE/AOxv3dOhn07hATYKXESRno4S08QBN4qo04G1eVgkGWcDTZm8ZuRepm2JIyds2bDwXsP+W IstKy485bA9ub1xhdmwr0yNwpmRrZTh6oFFI9QujBmycYP1zRxTDiH8QwPvSD0Pre9cJo3kAHXU6 sj0dIYICVIINRm1zbdxZ4eiob2F/NqWjbcykSxnE2Wb831U6nwbBdB7OoJBOpHCwUiOBE/tBYMZR pGvRGbsntbfX4Go/Wk4CjC45G8Q1jVpxOczBmy90xUth7UTiP+jK7uxzddkTng36Mofe/ifiuqwJ bY6cWTwuvrIM1DEa8ByTUMqE6XHdbBuWgT6HwIlL2103YzLngd18G8rcjfI3wUOEW1kKMwRXpZDq 0uojFVk7v3dFW/coPetf23Pac+clXBLw7+wWOu27+eO1u/oNAAD//wMAUEsDBBQABgAIAAAAIQB4 llMx4gAAAAsBAAAPAAAAZHJzL2Rvd25yZXYueG1sTI/NasMwEITvhb6D2EJvjez8uIlrOYTQ9hQK TQolN8Xa2CbWyliK7bx9t6f2tsMOM99k69E2osfO144UxJMIBFLhTE2lgq/D29MShA+ajG4coYIb eljn93eZTo0b6BP7fSgFh5BPtYIqhDaV0hcVWu0nrkXi39l1VgeWXSlNpwcOt42cRlEira6JGyrd 4rbC4rK/WgXvgx42s/i1313O29vxsPj43sWo1OPDuHkBEXAMf2b4xWd0yJnp5K5kvGhYzxJGD3wk MY9ix2L5PAdxUjCdryKQeSb/b8h/AAAA//8DAFBLAQItABQABgAIAAAAIQC2gziS/gAAAOEBAAAT AAAAAAAAAAAAAAAAAAAAAABbQ29udGVudF9UeXBlc10ueG1sUEsBAi0AFAAGAAgAAAAhADj9If/W AAAAlAEAAAsAAAAAAAAAAAAAAAAALwEAAF9yZWxzLy5yZWxzUEsBAi0AFAAGAAgAAAAhAFHeI5co AwAAvgcAAA4AAAAAAAAAAAAAAAAALgIAAGRycy9lMm9Eb2MueG1sUEsBAi0AFAAGAAgAAAAhAHiW UzHiAAAACwEAAA8AAAAAAAAAAAAAAAAAggUAAGRycy9kb3ducmV2LnhtbFBLBQYAAAAABAAEAPMA AACRBgAAAAA= ">
-                <v:shape id="Cuadro de texto 2" o:spid="_x0000_s1033" type="#_x0000_t202" style="position:absolute;top:397;width:28454;height:5201;visibility:visible;mso-wrap-style:square;v-text-anchor:top" o:gfxdata="UEsDBBQABgAIAAAAIQDb4fbL7gAAAIUBAAATAAAAW0NvbnRlbnRfVHlwZXNdLnhtbHyQz07DMAyH 70i8Q+QralM4IITa7kDhCAiNB7ASt43WOlEcyvb2pNu4IODoPz9/n1xv9vOkForiPDdwXVagiI23 jocG3rdPxR0oScgWJ8/UwIEENu3lRb09BBKV0ywNjCmFe63FjDSjlD4Q50nv44wpl3HQAc0OB9I3 VXWrjedEnIq03oC27qjHjympx31un0wiTQLq4bS4shrAECZnMGVTvbD9QSnOhDInjzsyuiBXWQP0 r4R18jfgnHvJr4nOknrFmJ5xzhraRtHWf3Kkpfz/yGo5S+H73hkquyhdjr3R8m2lj09svwAAAP// AwBQSwMEFAAGAAgAAAAhAFr0LFu/AAAAFQEAAAsAAABfcmVscy8ucmVsc2zPwWrDMAwG4Ptg72B0 X5TuUMaI01uh19I+gLGVxCy2jGSy9e1nemrHjpL4P0nD4SetZiPRyNnCruvBUPYcYp4tXC/Htw8w Wl0ObuVMFm6kcBhfX4Yzra62kC6xqGlKVgtLreUTUf1CyWnHhXKbTCzJ1VbKjMX5LzcTvvf9HuXR gPHJNKdgQU5hB+ZyK23zHztFL6w81c5zQp6m6P9TMfB3PtPWFCczVQtB9N4U2rp2HOA44NMz4y8A AAD//wMAUEsDBBQABgAIAAAAIQDPjPpvygAAAOMAAAAPAAAAZHJzL2Rvd25yZXYueG1sRI/NasJA FIX3Bd9huEJ3dRJrbBsdpRQKpbhQ20WXl8w1E5O5EzOjxrd3CoLLw/n5OPNlbxtxos5XjhWkowQE ceF0xaWC35/Pp1cQPiBrbByTggt5WC4GD3PMtTvzhk7bUIo4wj5HBSaENpfSF4Ys+pFriaO3c53F EGVXSt3hOY7bRo6TZCotVhwJBlv6MFTU26ONkJUvjht32KerWv6ZeorZ2nwr9Tjs32cgAvXhHr61 v7SCcZo+v2WTLHuB/0/xD8jFFQAA//8DAFBLAQItABQABgAIAAAAIQDb4fbL7gAAAIUBAAATAAAA AAAAAAAAAAAAAAAAAABbQ29udGVudF9UeXBlc10ueG1sUEsBAi0AFAAGAAgAAAAhAFr0LFu/AAAA FQEAAAsAAAAAAAAAAAAAAAAAHwEAAF9yZWxzLy5yZWxzUEsBAi0AFAAGAAgAAAAhAM+M+m/KAAAA 4wAAAA8AAAAAAAAAAAAAAAAABwIAAGRycy9kb3ducmV2LnhtbFBLBQYAAAAAAwADALcAAAD+AgAA AAA= " stroked="f">
+              <v:group w14:anchorId="4A7B37FD" id="Grupo 11" o:spid="_x0000_s1032" style="position:absolute;margin-left:68.4pt;margin-top:80.5pt;width:225.3pt;height:44pt;z-index:487613440;mso-position-horizontal-relative:page;mso-position-vertical-relative:text;mso-height-relative:margin" coordsize="28613,5598" o:gfxdata="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">
+                <v:shape id="Cuadro de texto 2" o:spid="_x0000_s1033" type="#_x0000_t202" style="position:absolute;top:397;width:28454;height:5201;visibility:visible;mso-wrap-style:square;v-text-anchor:top" o:gfxdata="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" stroked="f">
                   <v:textbox style="mso-fit-shape-to-text:t">
                     <w:txbxContent>
                       <w:p>
@@ -4501,7 +4501,7 @@
                     </w:txbxContent>
                   </v:textbox>
                 </v:shape>
-                <v:line id="Conector recto 10" o:spid="_x0000_s1034" style="position:absolute;visibility:visible;mso-wrap-style:square" from="159,0" to="28613,0" o:connectortype="straight" o:gfxdata="UEsDBBQABgAIAAAAIQDb4fbL7gAAAIUBAAATAAAAW0NvbnRlbnRfVHlwZXNdLnhtbHyQz07DMAyH 70i8Q+QralM4IITa7kDhCAiNB7ASt43WOlEcyvb2pNu4IODoPz9/n1xv9vOkForiPDdwXVagiI23 jocG3rdPxR0oScgWJ8/UwIEENu3lRb09BBKV0ywNjCmFe63FjDSjlD4Q50nv44wpl3HQAc0OB9I3 VXWrjedEnIq03oC27qjHjympx31un0wiTQLq4bS4shrAECZnMGVTvbD9QSnOhDInjzsyuiBXWQP0 r4R18jfgnHvJr4nOknrFmJ5xzhraRtHWf3Kkpfz/yGo5S+H73hkquyhdjr3R8m2lj09svwAAAP// AwBQSwMEFAAGAAgAAAAhAFr0LFu/AAAAFQEAAAsAAABfcmVscy8ucmVsc2zPwWrDMAwG4Ptg72B0 X5TuUMaI01uh19I+gLGVxCy2jGSy9e1nemrHjpL4P0nD4SetZiPRyNnCruvBUPYcYp4tXC/Htw8w Wl0ObuVMFm6kcBhfX4Yzra62kC6xqGlKVgtLreUTUf1CyWnHhXKbTCzJ1VbKjMX5LzcTvvf9HuXR gPHJNKdgQU5hB+ZyK23zHztFL6w81c5zQp6m6P9TMfB3PtPWFCczVQtB9N4U2rp2HOA44NMz4y8A AAD//wMAUEsDBBQABgAIAAAAIQArhvS4ygAAAOIAAAAPAAAAZHJzL2Rvd25yZXYueG1sRI9dS8Mw FIbvhf2HcATvXLpOm1GXjTIY+HG1TfH20BzbanNSkthVf725EHb58n7xrLeT7cVIPnSONSzmGQji 2pmOGw2vp/3tCkSIyAZ7x6ThhwJsN7OrNZbGnflA4zE2Io1wKFFDG+NQShnqliyGuRuIk/fhvMWY pG+k8XhO47aXeZYV0mLH6aHFgXYt1V/Hb6thVT9/+kpVT4v7t0H9jvlLsX9XWt9cT9UDiEhTvIT/ 249Gg1rm+VLdFQkiISUckJs/AAAA//8DAFBLAQItABQABgAIAAAAIQDb4fbL7gAAAIUBAAATAAAA AAAAAAAAAAAAAAAAAABbQ29udGVudF9UeXBlc10ueG1sUEsBAi0AFAAGAAgAAAAhAFr0LFu/AAAA FQEAAAsAAAAAAAAAAAAAAAAAHwEAAF9yZWxzLy5yZWxzUEsBAi0AFAAGAAgAAAAhACuG9LjKAAAA 4gAAAA8AAAAAAAAAAAAAAAAABwIAAGRycy9kb3ducmV2LnhtbFBLBQYAAAAAAwADALcAAAD+AgAA AAA= " strokecolor="black [3213]"/>
+                <v:line id="Conector recto 10" o:spid="_x0000_s1034" style="position:absolute;visibility:visible;mso-wrap-style:square" from="159,0" to="28613,0" o:connectortype="straight" o:gfxdata="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" strokecolor="black [3213]"/>
                 <w10:wrap anchorx="page"/>
               </v:group>
             </w:pict>
@@ -4633,8 +4633,8 @@
           </mc:Choice>
           <mc:Fallback>
             <w:pict>
-              <v:group w14:anchorId="0141994A" id="_x0000_s1035" style="position:absolute;margin-left:314.4pt;margin-top:80.25pt;width:225.3pt;height:22pt;z-index:487614464;mso-position-horizontal-relative:page;mso-position-vertical-relative:text;mso-height-relative:margin" coordsize="28613,2797" o:gfxdata="UEsDBBQABgAIAAAAIQC2gziS/gAAAOEBAAATAAAAW0NvbnRlbnRfVHlwZXNdLnhtbJSRQU7DMBBF 90jcwfIWJU67QAgl6YK0S0CoHGBkTxKLZGx5TGhvj5O2G0SRWNoz/78nu9wcxkFMGNg6quQqL6RA 0s5Y6ir5vt9lD1JwBDIwOMJKHpHlpr69KfdHjyxSmriSfYz+USnWPY7AufNIadK6MEJMx9ApD/oD OlTrorhX2lFEilmcO2RdNtjC5xDF9pCuTyYBB5bi6bQ4syoJ3g9WQ0ymaiLzg5KdCXlKLjvcW893 SUOqXwnz5DrgnHtJTxOsQfEKIT7DmDSUCaxw7Rqn8787ZsmRM9e2VmPeBN4uqYvTtW7jvijg9N/y JsXecLq0q+WD6m8AAAD//wMAUEsDBBQABgAIAAAAIQA4/SH/1gAAAJQBAAALAAAAX3JlbHMvLnJl bHOkkMFqwzAMhu+DvYPRfXGawxijTi+j0GvpHsDYimMaW0Yy2fr2M4PBMnrbUb/Q94l/f/hMi1qR JVI2sOt6UJgd+ZiDgffL8ekFlFSbvV0oo4EbChzGx4f9GRdb25HMsYhqlCwG5lrLq9biZkxWOiqY 22YiTra2kYMu1l1tQD30/bPm3wwYN0x18gb45AdQl1tp5j/sFB2T0FQ7R0nTNEV3j6o9feQzro1i OWA14Fm+Q8a1a8+Bvu/d/dMb2JY5uiPbhG/ktn4cqGU/er3pcvwCAAD//wMAUEsDBBQABgAIAAAA IQDb4hDCJwMAAL0HAAAOAAAAZHJzL2Uyb0RvYy54bWy0ld1u2yAUx+8n7R0Q96s/8uHEqlN1aVNN 6rZq3R6AYGyjYfCAxOmefgfsOEmbaVqn+cIGwzkcfud/4PJqVwu0ZdpwJTMcXYQYMUlVzmWZ4W9f V+9mGBlLZE6EkizDT8zgq8XbN5dtk7JYVUrkTCNwIk3aNhmurG3SIDC0YjUxF6phEgYLpWtioavL INekBe+1COIwnAat0nmjFWXGwN+bbhAvvP+iYNR+LgrDLBIZhtisf2v/Xrt3sLgkaalJU3Hah0Fe EUVNuIRFB1c3xBK00fyFq5pTrYwq7AVVdaCKglPm9wC7icJnu7nTatP4vZRpWzYDJkD7jNOr3dJP 2zvdPDYPGki0TQksfM/tZVfo2n0hSrTzyJ4GZGxnEYWf8WwajSIgS2EsTubjsGdKKwD/woxWt8eG o2QwTGZTl4xgv2xwEkzbgDzMgYD5NwKPFWmYB2tSIPCgEc9BvfN4OotGY9iNJDWIdbkhuVYoZ8jC fhWKXYQuFLBxyJDdvVcAIfKpN829ot8NkmpZEVmya61VWzGSQ7CR39uRaefHOCfr9qPKYTWysco7 Ost9NE8mnhBJD+zHk/Fo0iME8iPPfkBI0kYbe8dUjVwjwxrKwa9AtvfGdrT3U1yijRI8X3EhfEeX 66XQaEugdFb+6RN0Mk1I1GZ4Pokn3rNUzh5ck7TmFkpb8DrDs9A9zpykjsitzH3bEi66NgQtJKTf IXJUOj52t9751CR78muVPwEzrbpKhpMHGpXSPzFqoYozbH5siGYYiQ8SuM+jsUun9Z3xJImho49H 1scjRFJwlWGLUddcWn9UeBzNNeRnxT02F2UXSR8yaLOL+L+LNJnGcZwkIZyrvUjhXKVWARP3QVCL gLZX2lL2db2Huq+uoaijyTyMMTpX2Efi+oOuBJeumkj6G125zD5Xlzvg2aAvu+sq5GTWeU0Y+ySY 8yfkF1aAOg4FeOqTUMqk3fv1s51ZAfocDEMftr9tDsGcGvbznSnzF8rfGA8WfmUl7WBcc6n0udUP KIpu/r4qun0fpAdp9uXiteePS7gj4N/JJXTc9/MPt+7iFwAAAP//AwBQSwMEFAAGAAgAAAAhACtH zmriAAAADAEAAA8AAABkcnMvZG93bnJldi54bWxMj0FLw0AUhO+C/2F5gje7m9jENmZTSlFPRbAV pLdt9jUJzb4N2W2S/nu3Jz0OM8x8k68m07IBe9dYkhDNBDCk0uqGKgnf+/enBTDnFWnVWkIJV3Sw Ku7vcpVpO9IXDjtfsVBCLlMSau+7jHNX1miUm9kOKXgn2xvlg+wrrns1hnLT8liIlBvVUFioVYeb Gsvz7mIkfIxqXD9Hb8P2fNpcD/vk82cboZSPD9P6FZjHyf+F4YYf0KEITEd7Ie1YKyGNFwHdByMV CbBbQrws58COEmIxT4AXOf9/ovgFAAD//wMAUEsBAi0AFAAGAAgAAAAhALaDOJL+AAAA4QEAABMA AAAAAAAAAAAAAAAAAAAAAFtDb250ZW50X1R5cGVzXS54bWxQSwECLQAUAAYACAAAACEAOP0h/9YA AACUAQAACwAAAAAAAAAAAAAAAAAvAQAAX3JlbHMvLnJlbHNQSwECLQAUAAYACAAAACEA2+IQwicD AAC9BwAADgAAAAAAAAAAAAAAAAAuAgAAZHJzL2Uyb0RvYy54bWxQSwECLQAUAAYACAAAACEAK0fO auIAAAAMAQAADwAAAAAAAAAAAAAAAACBBQAAZHJzL2Rvd25yZXYueG1sUEsFBgAAAAAEAAQA8wAA AJAGAAAAAA== ">
-                <v:shape id="Cuadro de texto 2" o:spid="_x0000_s1036" type="#_x0000_t202" style="position:absolute;top:397;width:28454;height:2400;visibility:visible;mso-wrap-style:square;v-text-anchor:top" o:gfxdata="UEsDBBQABgAIAAAAIQDb4fbL7gAAAIUBAAATAAAAW0NvbnRlbnRfVHlwZXNdLnhtbHyQz07DMAyH 70i8Q+QralM4IITa7kDhCAiNB7ASt43WOlEcyvb2pNu4IODoPz9/n1xv9vOkForiPDdwXVagiI23 jocG3rdPxR0oScgWJ8/UwIEENu3lRb09BBKV0ywNjCmFe63FjDSjlD4Q50nv44wpl3HQAc0OB9I3 VXWrjedEnIq03oC27qjHjympx31un0wiTQLq4bS4shrAECZnMGVTvbD9QSnOhDInjzsyuiBXWQP0 r4R18jfgnHvJr4nOknrFmJ5xzhraRtHWf3Kkpfz/yGo5S+H73hkquyhdjr3R8m2lj09svwAAAP// AwBQSwMEFAAGAAgAAAAhAFr0LFu/AAAAFQEAAAsAAABfcmVscy8ucmVsc2zPwWrDMAwG4Ptg72B0 X5TuUMaI01uh19I+gLGVxCy2jGSy9e1nemrHjpL4P0nD4SetZiPRyNnCruvBUPYcYp4tXC/Htw8w Wl0ObuVMFm6kcBhfX4Yzra62kC6xqGlKVgtLreUTUf1CyWnHhXKbTCzJ1VbKjMX5LzcTvvf9HuXR gPHJNKdgQU5hB+ZyK23zHztFL6w81c5zQp6m6P9TMfB3PtPWFCczVQtB9N4U2rp2HOA44NMz4y8A AAD//wMAUEsDBBQABgAIAAAAIQAF2GDsxgAAAOIAAAAPAAAAZHJzL2Rvd25yZXYueG1sRE9NT8JA EL2b8B82Q+JNtkVtoLIQY2JiDAdBDx4n3aFb252t3QXqv2cOJB5f3vdqM/pOnWiITWAD+SwDRVwF 23Bt4Ovz9W4BKiZki11gMvBHETbryc0KSxvOvKPTPtVKQjiWaMCl1Jdax8qRxzgLPbFwhzB4TAKH WtsBzxLuOz3PskJ7bFgaHPb04qhq90cvJdtYHXfh9yfftvrbtQU+frh3Y26n4/MTqERj+hdf3W9W 5i/nxSK/f5ATckkw6PUFAAD//wMAUEsBAi0AFAAGAAgAAAAhANvh9svuAAAAhQEAABMAAAAAAAAA AAAAAAAAAAAAAFtDb250ZW50X1R5cGVzXS54bWxQSwECLQAUAAYACAAAACEAWvQsW78AAAAVAQAA CwAAAAAAAAAAAAAAAAAfAQAAX3JlbHMvLnJlbHNQSwECLQAUAAYACAAAACEABdhg7MYAAADiAAAA DwAAAAAAAAAAAAAAAAAHAgAAZHJzL2Rvd25yZXYueG1sUEsFBgAAAAADAAMAtwAAAPoCAAAAAA== " stroked="f">
+              <v:group w14:anchorId="0141994A" id="_x0000_s1035" style="position:absolute;margin-left:314.4pt;margin-top:80.25pt;width:225.3pt;height:22pt;z-index:487614464;mso-position-horizontal-relative:page;mso-position-vertical-relative:text;mso-height-relative:margin" coordsize="28613,2797" o:gfxdata="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">
+                <v:shape id="Cuadro de texto 2" o:spid="_x0000_s1036" type="#_x0000_t202" style="position:absolute;top:397;width:28454;height:2400;visibility:visible;mso-wrap-style:square;v-text-anchor:top" o:gfxdata="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" stroked="f">
                   <v:textbox style="mso-fit-shape-to-text:t">
                     <w:txbxContent>
                       <w:p>
@@ -4656,7 +4656,7 @@
                     </w:txbxContent>
                   </v:textbox>
                 </v:shape>
-                <v:line id="Conector recto 10" o:spid="_x0000_s1037" style="position:absolute;visibility:visible;mso-wrap-style:square" from="159,0" to="28613,0" o:connectortype="straight" o:gfxdata="UEsDBBQABgAIAAAAIQDb4fbL7gAAAIUBAAATAAAAW0NvbnRlbnRfVHlwZXNdLnhtbHyQz07DMAyH 70i8Q+QralM4IITa7kDhCAiNB7ASt43WOlEcyvb2pNu4IODoPz9/n1xv9vOkForiPDdwXVagiI23 jocG3rdPxR0oScgWJ8/UwIEENu3lRb09BBKV0ywNjCmFe63FjDSjlD4Q50nv44wpl3HQAc0OB9I3 VXWrjedEnIq03oC27qjHjympx31un0wiTQLq4bS4shrAECZnMGVTvbD9QSnOhDInjzsyuiBXWQP0 r4R18jfgnHvJr4nOknrFmJ5xzhraRtHWf3Kkpfz/yGo5S+H73hkquyhdjr3R8m2lj09svwAAAP// AwBQSwMEFAAGAAgAAAAhAFr0LFu/AAAAFQEAAAsAAABfcmVscy8ucmVsc2zPwWrDMAwG4Ptg72B0 X5TuUMaI01uh19I+gLGVxCy2jGSy9e1nemrHjpL4P0nD4SetZiPRyNnCruvBUPYcYp4tXC/Htw8w Wl0ObuVMFm6kcBhfX4Yzra62kC6xqGlKVgtLreUTUf1CyWnHhXKbTCzJ1VbKjMX5LzcTvvf9HuXR gPHJNKdgQU5hB+ZyK23zHztFL6w81c5zQp6m6P9TMfB3PtPWFCczVQtB9N4U2rp2HOA44NMz4y8A AAD//wMAUEsDBBQABgAIAAAAIQD4Fp7yxgAAAOIAAAAPAAAAZHJzL2Rvd25yZXYueG1sRE/PS8Mw FL4L/g/hCd5cuoDNqMtGGQw2PTkVr4/m2Vabl5JkXfWvNwfB48f3e72d3SAmCrH3bGC5KEAQN972 3Bp4fdnfrUDEhGxx8EwGvinCdnN9tcbK+gs/03RKrcghHCs00KU0VlLGpiOHceFH4sx9+OAwZRha aQNecrgbpCqKUjrsOTd0ONKuo+brdHYGVs3jZ6h1fVzev436Z1JP5f5dG3N7M9cPIBLN6V/85z5Y A7pUSmld5M35Ur4DcvMLAAD//wMAUEsBAi0AFAAGAAgAAAAhANvh9svuAAAAhQEAABMAAAAAAAAA AAAAAAAAAAAAAFtDb250ZW50X1R5cGVzXS54bWxQSwECLQAUAAYACAAAACEAWvQsW78AAAAVAQAA CwAAAAAAAAAAAAAAAAAfAQAAX3JlbHMvLnJlbHNQSwECLQAUAAYACAAAACEA+Bae8sYAAADiAAAA DwAAAAAAAAAAAAAAAAAHAgAAZHJzL2Rvd25yZXYueG1sUEsFBgAAAAADAAMAtwAAAPoCAAAAAA== " strokecolor="black [3213]"/>
+                <v:line id="Conector recto 10" o:spid="_x0000_s1037" style="position:absolute;visibility:visible;mso-wrap-style:square" from="159,0" to="28613,0" o:connectortype="straight" o:gfxdata="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" strokecolor="black [3213]"/>
                 <w10:wrap anchorx="page"/>
               </v:group>
             </w:pict>
@@ -16878,8 +16878,8 @@
           </mc:Choice>
           <mc:Fallback>
             <w:pict>
-              <v:group w14:anchorId="4E422820" id="_x0000_s1038" style="position:absolute;margin-left:314.4pt;margin-top:17.8pt;width:225.3pt;height:22pt;z-index:487617536;mso-position-horizontal-relative:page;mso-position-vertical-relative:text;mso-height-relative:margin" coordsize="28613,2797" o:gfxdata="UEsDBBQABgAIAAAAIQC2gziS/gAAAOEBAAATAAAAW0NvbnRlbnRfVHlwZXNdLnhtbJSRQU7DMBBF 90jcwfIWJU67QAgl6YK0S0CoHGBkTxKLZGx5TGhvj5O2G0SRWNoz/78nu9wcxkFMGNg6quQqL6RA 0s5Y6ir5vt9lD1JwBDIwOMJKHpHlpr69KfdHjyxSmriSfYz+USnWPY7AufNIadK6MEJMx9ApD/oD OlTrorhX2lFEilmcO2RdNtjC5xDF9pCuTyYBB5bi6bQ4syoJ3g9WQ0ymaiLzg5KdCXlKLjvcW893 SUOqXwnz5DrgnHtJTxOsQfEKIT7DmDSUCaxw7Rqn8787ZsmRM9e2VmPeBN4uqYvTtW7jvijg9N/y JsXecLq0q+WD6m8AAAD//wMAUEsDBBQABgAIAAAAIQA4/SH/1gAAAJQBAAALAAAAX3JlbHMvLnJl bHOkkMFqwzAMhu+DvYPRfXGawxijTi+j0GvpHsDYimMaW0Yy2fr2M4PBMnrbUb/Q94l/f/hMi1qR JVI2sOt6UJgd+ZiDgffL8ekFlFSbvV0oo4EbChzGx4f9GRdb25HMsYhqlCwG5lrLq9biZkxWOiqY 22YiTra2kYMu1l1tQD30/bPm3wwYN0x18gb45AdQl1tp5j/sFB2T0FQ7R0nTNEV3j6o9feQzro1i OWA14Fm+Q8a1a8+Bvu/d/dMb2JY5uiPbhG/ktn4cqGU/er3pcvwCAAD//wMAUEsDBBQABgAIAAAA IQCeze1HKAMAAL8HAAAOAAAAZHJzL2Uyb0RvYy54bWy0lVtv2yAUx98n7Tsg3ldfYudi1am6tKkm dVu1bh+AYHzRMHhAYneffgfsOEmbaVqn+cEGwzkcfud/4PKqqznaMaUrKVIcXPgYMUFlVokixd++ rt/NMdKGiIxwKViKn5jGV8u3by7bJmGhLCXPmELgROikbVJcGtMknqdpyWqiL2TDBAzmUtXEQFcV XqZIC95r7oW+P/VaqbJGScq0hr83/SBeOv95zqj5nOeaGcRTDLEZ91buvbFvb3lJkkKRpqzoEAZ5 RRQ1qQQsOrq6IYagrapeuKorqqSWubmgsvZknleUuT3AbgL/2W7ulNw2bi9F0hbNiAnQPuP0arf0 0+5ONY/NgwISbVMAC9eze+lyVdsvRIk6h+xpRMY6gyj8DOfTYBIAWQpj4WwR+QNTWgL4F2a0vD02 nMxGw9l8apPh7Zf1ToJpG5CHPhDQ/0bgsSQNc2B1AgQeFKoyUO9iEk/9MAoCjASpQa2rLcmURBlD BjYsUWhDtLGAkWWGTPdeAoXA5V4395J+10jIVUlEwa6Vkm3JSAbRBm5zR6a9H22dbNqPMoPVyNZI 5+gs+MliFjtEJDnAj+JoEg8MAf3EwR8ZkqRR2twxWSPbSLGCenArkN29Nj3u/RSbaS15la0rzl1H FZsVV2hHoHbW7hkydDKNC9SmeBGHsfMspLUH1ySpKwO1zas6xXPfPtacJJbIrchc25CK920ImgvI v0VkqfR8TLfpXG7me/IbmT0BMyX7UoajBxqlVD8xaqGMU6x/bIliGPEPArgvgiiyde86UTwLoaOO RzbHI0RQcJVig1HfXBl3VjgczTXkZ105bDbKPpIhZBBnH/H/V2k0CadhNF/AyTqoFE5WaiRAsR8E 1QhsB6mtxFDZe6r7+hrLOogXfojRudI+UtcfhMUrYeuJJL8Rlk3tc3nZI56NAjNdXyIns86LQpsn zqw/Lr6wHORxqMBTn4RSJszer5ttzXIQ6Gjou7DdfXMI5tRwmG9NmbtS/sZ4tHArS2FG47oSUp1b /YAi7+fvy6Lf90F7kGZXL0587sCEWwL+nVxDx303/3DvLn8BAAD//wMAUEsDBBQABgAIAAAAIQCg +Eqy4QAAAAoBAAAPAAAAZHJzL2Rvd25yZXYueG1sTI9Ba8JAFITvhf6H5RV6q5tojZrmRUTanqRQ LZTe1uwzCWbfhuyaxH/f9dQehxlmvsnWo2lET52rLSPEkwgEcWF1zSXC1+HtaQnCecVaNZYJ4UoO 1vn9XaZSbQf+pH7vSxFK2KUKofK+TaV0RUVGuYltiYN3sp1RPsiulLpTQyg3jZxGUSKNqjksVKql bUXFeX8xCO+DGjaz+LXfnU/b689h/vG9iwnx8WHcvIDwNPq/MNzwAzrkgeloL6ydaBCS6TKge4TZ PAFxC0SL1TOII8JilYDMM/n/Qv4LAAD//wMAUEsBAi0AFAAGAAgAAAAhALaDOJL+AAAA4QEAABMA AAAAAAAAAAAAAAAAAAAAAFtDb250ZW50X1R5cGVzXS54bWxQSwECLQAUAAYACAAAACEAOP0h/9YA AACUAQAACwAAAAAAAAAAAAAAAAAvAQAAX3JlbHMvLnJlbHNQSwECLQAUAAYACAAAACEAns3tRygD AAC/BwAADgAAAAAAAAAAAAAAAAAuAgAAZHJzL2Uyb0RvYy54bWxQSwECLQAUAAYACAAAACEAoPhK suEAAAAKAQAADwAAAAAAAAAAAAAAAACCBQAAZHJzL2Rvd25yZXYueG1sUEsFBgAAAAAEAAQA8wAA AJAGAAAAAA== ">
-                <v:shape id="Cuadro de texto 2" o:spid="_x0000_s1039" type="#_x0000_t202" style="position:absolute;top:397;width:28454;height:2400;visibility:visible;mso-wrap-style:square;v-text-anchor:top" o:gfxdata="UEsDBBQABgAIAAAAIQDb4fbL7gAAAIUBAAATAAAAW0NvbnRlbnRfVHlwZXNdLnhtbHyQz07DMAyH 70i8Q+QralM4IITa7kDhCAiNB7ASt43WOlEcyvb2pNu4IODoPz9/n1xv9vOkForiPDdwXVagiI23 jocG3rdPxR0oScgWJ8/UwIEENu3lRb09BBKV0ywNjCmFe63FjDSjlD4Q50nv44wpl3HQAc0OB9I3 VXWrjedEnIq03oC27qjHjympx31un0wiTQLq4bS4shrAECZnMGVTvbD9QSnOhDInjzsyuiBXWQP0 r4R18jfgnHvJr4nOknrFmJ5xzhraRtHWf3Kkpfz/yGo5S+H73hkquyhdjr3R8m2lj09svwAAAP// AwBQSwMEFAAGAAgAAAAhAFr0LFu/AAAAFQEAAAsAAABfcmVscy8ucmVsc2zPwWrDMAwG4Ptg72B0 X5TuUMaI01uh19I+gLGVxCy2jGSy9e1nemrHjpL4P0nD4SetZiPRyNnCruvBUPYcYp4tXC/Htw8w Wl0ObuVMFm6kcBhfX4Yzra62kC6xqGlKVgtLreUTUf1CyWnHhXKbTCzJ1VbKjMX5LzcTvvf9HuXR gPHJNKdgQU5hB+ZyK23zHztFL6w81c5zQp6m6P9TMfB3PtPWFCczVQtB9N4U2rp2HOA44NMz4y8A AAD//wMAUEsDBBQABgAIAAAAIQDbdl3fywAAAOMAAAAPAAAAZHJzL2Rvd25yZXYueG1sRI9Pa8JA EMXvBb/DMkJvdROtwaauIgWhFA/+O/Q4ZKfZmOxsml01/fZdQfA4896835v5sreNuFDnK8cK0lEC grhwuuJSwfGwfpmB8AFZY+OYFPyRh+Vi8DTHXLsr7+iyD6WIIexzVGBCaHMpfWHIoh+5ljhqP66z GOLYlVJ3eI3htpHjJMmkxYojwWBLH4aKen+2EbLxxXnnfk/pppbfps5wujVfSj0P+9U7iEB9eJjv 15861n+bTLNk/JqmcPspLkAu/gEAAP//AwBQSwECLQAUAAYACAAAACEA2+H2y+4AAACFAQAAEwAA AAAAAAAAAAAAAAAAAAAAW0NvbnRlbnRfVHlwZXNdLnhtbFBLAQItABQABgAIAAAAIQBa9CxbvwAA ABUBAAALAAAAAAAAAAAAAAAAAB8BAABfcmVscy8ucmVsc1BLAQItABQABgAIAAAAIQDbdl3fywAA AOMAAAAPAAAAAAAAAAAAAAAAAAcCAABkcnMvZG93bnJldi54bWxQSwUGAAAAAAMAAwC3AAAA/wIA AAAA " stroked="f">
+              <v:group w14:anchorId="4E422820" id="_x0000_s1038" style="position:absolute;margin-left:314.4pt;margin-top:17.8pt;width:225.3pt;height:22pt;z-index:487617536;mso-position-horizontal-relative:page;mso-position-vertical-relative:text;mso-height-relative:margin" coordsize="28613,2797" o:gfxdata="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">
+                <v:shape id="Cuadro de texto 2" o:spid="_x0000_s1039" type="#_x0000_t202" style="position:absolute;top:397;width:28454;height:2400;visibility:visible;mso-wrap-style:square;v-text-anchor:top" o:gfxdata="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" stroked="f">
                   <v:textbox style="mso-fit-shape-to-text:t">
                     <w:txbxContent>
                       <w:p>
@@ -16901,7 +16901,7 @@
                     </w:txbxContent>
                   </v:textbox>
                 </v:shape>
-                <v:line id="Conector recto 10" o:spid="_x0000_s1040" style="position:absolute;visibility:visible;mso-wrap-style:square" from="159,0" to="28613,0" o:connectortype="straight" o:gfxdata="UEsDBBQABgAIAAAAIQDb4fbL7gAAAIUBAAATAAAAW0NvbnRlbnRfVHlwZXNdLnhtbHyQz07DMAyH 70i8Q+QralM4IITa7kDhCAiNB7ASt43WOlEcyvb2pNu4IODoPz9/n1xv9vOkForiPDdwXVagiI23 jocG3rdPxR0oScgWJ8/UwIEENu3lRb09BBKV0ywNjCmFe63FjDSjlD4Q50nv44wpl3HQAc0OB9I3 VXWrjedEnIq03oC27qjHjympx31un0wiTQLq4bS4shrAECZnMGVTvbD9QSnOhDInjzsyuiBXWQP0 r4R18jfgnHvJr4nOknrFmJ5xzhraRtHWf3Kkpfz/yGo5S+H73hkquyhdjr3R8m2lj09svwAAAP// AwBQSwMEFAAGAAgAAAAhAFr0LFu/AAAAFQEAAAsAAABfcmVscy8ucmVsc2zPwWrDMAwG4Ptg72B0 X5TuUMaI01uh19I+gLGVxCy2jGSy9e1nemrHjpL4P0nD4SetZiPRyNnCruvBUPYcYp4tXC/Htw8w Wl0ObuVMFm6kcBhfX4Yzra62kC6xqGlKVgtLreUTUf1CyWnHhXKbTCzJ1VbKjMX5LzcTvvf9HuXR gPHJNKdgQU5hB+ZyK23zHztFL6w81c5zQp6m6P9TMfB3PtPWFCczVQtB9N4U2rp2HOA44NMz4y8A AAD//wMAUEsDBBQABgAIAAAAIQB0rlEqzQAAAOMAAAAPAAAAZHJzL2Rvd25yZXYueG1sRI/NTsMw EITvSLyDtZV6o05DSdJQt4qQKvFzooB6XcVLkhLbke2mgadnD0gcd2d25tvNbjK9GMmHzlkFy0UC gmztdGcbBe9v+5sCRIhoNfbOkoJvCrDbXl9tsNTuYl9pPMRGcIgNJSpoYxxKKUPdksGwcANZ1j6d Nxh59I3UHi8cbnqZJkkmDXaWG1oc6KGl+utwNgqK+vnkq7x6Wt59DPnPmL5k+2Ou1Hw2VfcgIk3x 3/x3/agZf3WbZumqWDM0/8QLkNtfAAAA//8DAFBLAQItABQABgAIAAAAIQDb4fbL7gAAAIUBAAAT AAAAAAAAAAAAAAAAAAAAAABbQ29udGVudF9UeXBlc10ueG1sUEsBAi0AFAAGAAgAAAAhAFr0LFu/ AAAAFQEAAAsAAAAAAAAAAAAAAAAAHwEAAF9yZWxzLy5yZWxzUEsBAi0AFAAGAAgAAAAhAHSuUSrN AAAA4wAAAA8AAAAAAAAAAAAAAAAABwIAAGRycy9kb3ducmV2LnhtbFBLBQYAAAAAAwADALcAAAAB AwAAAAA= " strokecolor="black [3213]"/>
+                <v:line id="Conector recto 10" o:spid="_x0000_s1040" style="position:absolute;visibility:visible;mso-wrap-style:square" from="159,0" to="28613,0" o:connectortype="straight" o:gfxdata="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" strokecolor="black [3213]"/>
                 <w10:wrap anchorx="page"/>
               </v:group>
             </w:pict>
@@ -17078,8 +17078,8 @@
           </mc:Choice>
           <mc:Fallback>
             <w:pict>
-              <v:group w14:anchorId="047A7E87" id="_x0000_s1041" style="position:absolute;margin-left:68.4pt;margin-top:4.1pt;width:225.3pt;height:44pt;z-index:487616512;mso-position-horizontal-relative:page;mso-position-vertical-relative:text;mso-height-relative:margin" coordsize="28613,5598" o:gfxdata="UEsDBBQABgAIAAAAIQC2gziS/gAAAOEBAAATAAAAW0NvbnRlbnRfVHlwZXNdLnhtbJSRQU7DMBBF 90jcwfIWJU67QAgl6YK0S0CoHGBkTxKLZGx5TGhvj5O2G0SRWNoz/78nu9wcxkFMGNg6quQqL6RA 0s5Y6ir5vt9lD1JwBDIwOMJKHpHlpr69KfdHjyxSmriSfYz+USnWPY7AufNIadK6MEJMx9ApD/oD OlTrorhX2lFEilmcO2RdNtjC5xDF9pCuTyYBB5bi6bQ4syoJ3g9WQ0ymaiLzg5KdCXlKLjvcW893 SUOqXwnz5DrgnHtJTxOsQfEKIT7DmDSUCaxw7Rqn8787ZsmRM9e2VmPeBN4uqYvTtW7jvijg9N/y JsXecLq0q+WD6m8AAAD//wMAUEsDBBQABgAIAAAAIQA4/SH/1gAAAJQBAAALAAAAX3JlbHMvLnJl bHOkkMFqwzAMhu+DvYPRfXGawxijTi+j0GvpHsDYimMaW0Yy2fr2M4PBMnrbUb/Q94l/f/hMi1qR JVI2sOt6UJgd+ZiDgffL8ekFlFSbvV0oo4EbChzGx4f9GRdb25HMsYhqlCwG5lrLq9biZkxWOiqY 22YiTra2kYMu1l1tQD30/bPm3wwYN0x18gb45AdQl1tp5j/sFB2T0FQ7R0nTNEV3j6o9feQzro1i OWA14Fm+Q8a1a8+Bvu/d/dMb2JY5uiPbhG/ktn4cqGU/er3pcvwCAAD//wMAUEsDBBQABgAIAAAA IQCRGw0/KwMAAL8HAAAOAAAAZHJzL2Uyb0RvYy54bWy0Vdly2yAUfe9M/4HhvdFiy4smciZ14kxn umSa9gMwQssUgQrYsvv1vaDNTtyHplM9SCC4h8u558D1zaHiaM+ULqVIcHDlY8QElWkp8gR//7Z5 t8BIGyJSwqVgCT4yjW9Wb99cN3XMQllInjKFAETouKkTXBhTx56nacEqoq9kzQQMZlJVxEBX5V6q SAPoFfdC3595jVRprSRlWsPfu3YQrxx+ljFqvmSZZgbxBENuxr2Ve2/t21tdkzhXpC5K2qVBXpFF RUoBiw5Qd8QQtFPlC6iqpEpqmZkrKitPZllJmdsD7Cbwn+3mQcld7faSx01eDzQBtc94ejUs/bx/ UPVT/aiAiabOgQvXs3s5ZKqyX8gSHRxlx4EydjCIws9wMQsmATBLYSyKFgu/45QWQPyLMFrcnwZO 5n3gcjEPbDG8flnvLJmmBnnokQH9bww8FaRmjlgdAwOPCpUpqHce+gs/COcRRoJUoNb1jqRKopQh AxuWKLQp2lwgyHKGzOG9BBYCV3tdf5T0h0ZCrgsicnarlGwKRlLItt3cSWiLoy3ItvkkU1iN7Ix0 QBeJnyznYdTqdSR/Gk1nQcchCGg6O+OQxLXS5oHJCtlGghX4wa1A9h+1aenup9hKa8nLdFNy7joq 3665QnsC3tm4p0M/m8YFahK8jCA5GyWkjQdoElelAW/zskowyAKeNnvLyL1I3RRDSt62ofBcQP0t RZaVlh9z2B5cbZY21o5tZXoEzpRsrQxHDzQKqX5h1ICNE6x/7ohiGPEPAnhfBtOp9b3rTCOoMEbq dGR7OkIEBagEG4za5tq4s8LRUd9CfTalo23MpEsZxNnm9/9V6i/DaDGfhpNBpXCyUiOBFPtB4MaO K1DpWnTO7lnt/TXYOoiWfojRJWuDuibgBWtthzmY84WweCmsn0j8B2HZ0j6Xlz3i2SAwc+j9f6Ku y6LQ5siZxePiK8tAHqMDzzEJpUyYHtfNtmEZCHQI9F3a7r4ZkzkP7ObbUOaulL8JHiLcylKYIbgq hVSXVh+pyNr5vS3afY/agzI7vzjxuQMTbgn4d3YNnfbd/PHeXf0GAAD//wMAUEsDBBQABgAIAAAA IQCJNeYR3wAAAAgBAAAPAAAAZHJzL2Rvd25yZXYueG1sTI9Ba4NAFITvhf6H5RV6a1ZNY611DSG0 PYVAk0LIbaMvKnHfirtR8+/7emqPwwwz32TLybRiwN41lhSEswAEUmHLhioF3/uPpwSE85pK3VpC BTd0sMzv7zKdlnakLxx2vhJcQi7VCmrvu1RKV9RotJvZDom9s+2N9iz7Spa9HrnctDIKglga3RAv 1LrDdY3FZXc1Cj5HPa7m4fuwuZzXt+N+sT1sQlTq8WFavYHwOPm/MPziMzrkzHSyVyqdaFnPY0b3 CpIIBPuL5OUZxEnBaxyBzDP5/0D+AwAA//8DAFBLAQItABQABgAIAAAAIQC2gziS/gAAAOEBAAAT AAAAAAAAAAAAAAAAAAAAAABbQ29udGVudF9UeXBlc10ueG1sUEsBAi0AFAAGAAgAAAAhADj9If/W AAAAlAEAAAsAAAAAAAAAAAAAAAAALwEAAF9yZWxzLy5yZWxzUEsBAi0AFAAGAAgAAAAhAJEbDT8r AwAAvwcAAA4AAAAAAAAAAAAAAAAALgIAAGRycy9lMm9Eb2MueG1sUEsBAi0AFAAGAAgAAAAhAIk1 5hHfAAAACAEAAA8AAAAAAAAAAAAAAAAAhQUAAGRycy9kb3ducmV2LnhtbFBLBQYAAAAABAAEAPMA AACRBgAAAAA= ">
-                <v:shape id="Cuadro de texto 2" o:spid="_x0000_s1042" type="#_x0000_t202" style="position:absolute;top:397;width:28454;height:5201;visibility:visible;mso-wrap-style:square;v-text-anchor:top" o:gfxdata="UEsDBBQABgAIAAAAIQDb4fbL7gAAAIUBAAATAAAAW0NvbnRlbnRfVHlwZXNdLnhtbHyQz07DMAyH 70i8Q+QralM4IITa7kDhCAiNB7ASt43WOlEcyvb2pNu4IODoPz9/n1xv9vOkForiPDdwXVagiI23 jocG3rdPxR0oScgWJ8/UwIEENu3lRb09BBKV0ywNjCmFe63FjDSjlD4Q50nv44wpl3HQAc0OB9I3 VXWrjedEnIq03oC27qjHjympx31un0wiTQLq4bS4shrAECZnMGVTvbD9QSnOhDInjzsyuiBXWQP0 r4R18jfgnHvJr4nOknrFmJ5xzhraRtHWf3Kkpfz/yGo5S+H73hkquyhdjr3R8m2lj09svwAAAP// AwBQSwMEFAAGAAgAAAAhAFr0LFu/AAAAFQEAAAsAAABfcmVscy8ucmVsc2zPwWrDMAwG4Ptg72B0 X5TuUMaI01uh19I+gLGVxCy2jGSy9e1nemrHjpL4P0nD4SetZiPRyNnCruvBUPYcYp4tXC/Htw8w Wl0ObuVMFm6kcBhfX4Yzra62kC6xqGlKVgtLreUTUf1CyWnHhXKbTCzJ1VbKjMX5LzcTvvf9HuXR gPHJNKdgQU5hB+ZyK23zHztFL6w81c5zQp6m6P9TMfB3PtPWFCczVQtB9N4U2rp2HOA44NMz4y8A AAD//wMAUEsDBBQABgAIAAAAIQD44cX+ywAAAOMAAAAPAAAAZHJzL2Rvd25yZXYueG1sRI9PawIx EMXvBb9DGMFbTXbBP2yNIgVBxEPVHnocNtPNupvJdhN1++2bQqHHmffm/d6sNoNrxZ36UHvWkE0V COLSm5orDe+X3fMSRIjIBlvPpOGbAmzWo6cVFsY/+ET3c6xECuFQoAYbY1dIGUpLDsPUd8RJ+/S9 w5jGvpKmx0cKd63MlZpLhzUngsWOXi2VzfnmEuQYytvJf12zYyM/bDPH2Zs9aD0ZD9sXEJGG+G/+ u96bVH+Rq6XK8sUMfn9KC5DrHwAAAP//AwBQSwECLQAUAAYACAAAACEA2+H2y+4AAACFAQAAEwAA AAAAAAAAAAAAAAAAAAAAW0NvbnRlbnRfVHlwZXNdLnhtbFBLAQItABQABgAIAAAAIQBa9CxbvwAA ABUBAAALAAAAAAAAAAAAAAAAAB8BAABfcmVscy8ucmVsc1BLAQItABQABgAIAAAAIQD44cX+ywAA AOMAAAAPAAAAAAAAAAAAAAAAAAcCAABkcnMvZG93bnJldi54bWxQSwUGAAAAAAMAAwC3AAAA/wIA AAAA " stroked="f">
+              <v:group w14:anchorId="047A7E87" id="_x0000_s1041" style="position:absolute;margin-left:68.4pt;margin-top:4.1pt;width:225.3pt;height:44pt;z-index:487616512;mso-position-horizontal-relative:page;mso-position-vertical-relative:text;mso-height-relative:margin" coordsize="28613,5598" o:gfxdata="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">
+                <v:shape id="Cuadro de texto 2" o:spid="_x0000_s1042" type="#_x0000_t202" style="position:absolute;top:397;width:28454;height:5201;visibility:visible;mso-wrap-style:square;v-text-anchor:top" o:gfxdata="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" stroked="f">
                   <v:textbox style="mso-fit-shape-to-text:t">
                     <w:txbxContent>
                       <w:p>
@@ -17137,7 +17137,7 @@
                     </w:txbxContent>
                   </v:textbox>
                 </v:shape>
-                <v:line id="Conector recto 10" o:spid="_x0000_s1043" style="position:absolute;visibility:visible;mso-wrap-style:square" from="159,0" to="28613,0" o:connectortype="straight" o:gfxdata="UEsDBBQABgAIAAAAIQDb4fbL7gAAAIUBAAATAAAAW0NvbnRlbnRfVHlwZXNdLnhtbHyQz07DMAyH 70i8Q+QralM4IITa7kDhCAiNB7ASt43WOlEcyvb2pNu4IODoPz9/n1xv9vOkForiPDdwXVagiI23 jocG3rdPxR0oScgWJ8/UwIEENu3lRb09BBKV0ywNjCmFe63FjDSjlD4Q50nv44wpl3HQAc0OB9I3 VXWrjedEnIq03oC27qjHjympx31un0wiTQLq4bS4shrAECZnMGVTvbD9QSnOhDInjzsyuiBXWQP0 r4R18jfgnHvJr4nOknrFmJ5xzhraRtHWf3Kkpfz/yGo5S+H73hkquyhdjr3R8m2lj09svwAAAP// AwBQSwMEFAAGAAgAAAAhAFr0LFu/AAAAFQEAAAsAAABfcmVscy8ucmVsc2zPwWrDMAwG4Ptg72B0 X5TuUMaI01uh19I+gLGVxCy2jGSy9e1nemrHjpL4P0nD4SetZiPRyNnCruvBUPYcYp4tXC/Htw8w Wl0ObuVMFm6kcBhfX4Yzra62kC6xqGlKVgtLreUTUf1CyWnHhXKbTCzJ1VbKjMX5LzcTvvf9HuXR gPHJNKdgQU5hB+ZyK23zHztFL6w81c5zQp6m6P9TMfB3PtPWFCczVQtB9N4U2rp2HOA44NMz4y8A AAD//wMAUEsDBBQABgAIAAAAIQAIX1MTyQAAAOMAAAAPAAAAZHJzL2Rvd25yZXYueG1sRE9fS8Mw EH8X/A7hBN9cuurWri4bRRg49+R07PVobm21uZQkdnWf3giCj/f7f8v1aDoxkPOtZQXTSQKCuLK6 5VrB+9vmLgfhA7LGzjIp+CYP69X11RILbc/8SsM+1CKGsC9QQRNCX0jpq4YM+ontiSN3ss5giKer pXZ4juGmk2mSzKXBlmNDgz09NVR97r+Mgrx6+XBlVm6ns0OfXYZ0N98cM6Vub8byEUSgMfyL/9zP Os5PFukszx7Se/j9KQIgVz8AAAD//wMAUEsBAi0AFAAGAAgAAAAhANvh9svuAAAAhQEAABMAAAAA AAAAAAAAAAAAAAAAAFtDb250ZW50X1R5cGVzXS54bWxQSwECLQAUAAYACAAAACEAWvQsW78AAAAV AQAACwAAAAAAAAAAAAAAAAAfAQAAX3JlbHMvLnJlbHNQSwECLQAUAAYACAAAACEACF9TE8kAAADj AAAADwAAAAAAAAAAAAAAAAAHAgAAZHJzL2Rvd25yZXYueG1sUEsFBgAAAAADAAMAtwAAAP0CAAAA AA== " strokecolor="black [3213]"/>
+                <v:line id="Conector recto 10" o:spid="_x0000_s1043" style="position:absolute;visibility:visible;mso-wrap-style:square" from="159,0" to="28613,0" o:connectortype="straight" o:gfxdata="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" strokecolor="black [3213]"/>
                 <w10:wrap anchorx="page"/>
               </v:group>
             </w:pict>
@@ -18896,8 +18896,8 @@
           </mc:Choice>
           <mc:Fallback>
             <w:pict>
-              <v:group w14:anchorId="3D3E9F9D" id="_x0000_s1044" style="position:absolute;left:0;text-align:left;margin-left:306.65pt;margin-top:286.45pt;width:225.3pt;height:22pt;z-index:487620608;mso-position-horizontal-relative:page;mso-position-vertical-relative:text;mso-height-relative:margin" coordsize="28613,2797" o:gfxdata="UEsDBBQABgAIAAAAIQC2gziS/gAAAOEBAAATAAAAW0NvbnRlbnRfVHlwZXNdLnhtbJSRQU7DMBBF 90jcwfIWJU67QAgl6YK0S0CoHGBkTxKLZGx5TGhvj5O2G0SRWNoz/78nu9wcxkFMGNg6quQqL6RA 0s5Y6ir5vt9lD1JwBDIwOMJKHpHlpr69KfdHjyxSmriSfYz+USnWPY7AufNIadK6MEJMx9ApD/oD OlTrorhX2lFEilmcO2RdNtjC5xDF9pCuTyYBB5bi6bQ4syoJ3g9WQ0ymaiLzg5KdCXlKLjvcW893 SUOqXwnz5DrgnHtJTxOsQfEKIT7DmDSUCaxw7Rqn8787ZsmRM9e2VmPeBN4uqYvTtW7jvijg9N/y JsXecLq0q+WD6m8AAAD//wMAUEsDBBQABgAIAAAAIQA4/SH/1gAAAJQBAAALAAAAX3JlbHMvLnJl bHOkkMFqwzAMhu+DvYPRfXGawxijTi+j0GvpHsDYimMaW0Yy2fr2M4PBMnrbUb/Q94l/f/hMi1qR JVI2sOt6UJgd+ZiDgffL8ekFlFSbvV0oo4EbChzGx4f9GRdb25HMsYhqlCwG5lrLq9biZkxWOiqY 22YiTra2kYMu1l1tQD30/bPm3wwYN0x18gb45AdQl1tp5j/sFB2T0FQ7R0nTNEV3j6o9feQzro1i OWA14Fm+Q8a1a8+Bvu/d/dMb2JY5uiPbhG/ktn4cqGU/er3pcvwCAAD//wMAUEsDBBQABgAIAAAA IQDpxBNDJgMAAL4HAAAOAAAAZHJzL2Uyb0RvYy54bWy0lVFv2yAQx98n7Tsg3lfHSRzHVp2qS5tq UrdV6/YBCMYxGgYPSJzu0+/Ajp20maZ1mh9sMNxx9+N/cHm1rwTaMW24khkOL0YYMUlVzuUmw9++ rt7NMTKWyJwIJVmGn5jBV4u3by6bOmVjVSqRM43AiTRpU2e4tLZOg8DQklXEXKiaSRgslK6Iha7e BLkmDXivRDAejWZBo3Rea0WZMfD3ph3EC++/KBi1n4vCMItEhiE269/av9fuHSwuSbrRpC457cIg r4iiIlzCor2rG2IJ2mr+wlXFqVZGFfaCqipQRcEp8zlANuHoWTZ3Wm1rn8smbTZ1jwnQPuP0arf0 0+5O14/1gwYSTb0BFr7nctkXunJfiBLtPbKnHhnbW0Th53g+CychkKUwNo6T6ahjSksA/8KMlrfH hpO4N4znM7cZwWHZ4CSYpgZ5mIGA+TcCjyWpmQdrUiDwoBHPMzyfTZJZMplMMZKkArEutyTXCuUM WchXobGL0IUCNg4Zsvv3CiCEfutNfa/od4OkWpZEbti11qopGckh2NDndmTa+jHOybr5qHJYjWyt 8o7Ocp8kceQJkXRgP42mk6hDCOQnnn2PkKS1NvaOqQq5RoY1lINfgezujW1pH6a4jTZK8HzFhfAd vVkvhUY7AqWz8k+3QSfThERNhpNoHHnPUjl7cE3SilsobcErIDtyjzMnqSNyK3PftoSLtg1BCwnb 7xA5Ki0fu1/v/daAwsDADa5V/gTQtGpLGY4eaJRK/8SogTLOsPmxJZphJD5IAJ+E06mre9+ZRvEY Ovp4ZH08QiQFVxm2GLXNpfVnhedRX8MGrbjnNkTSxQzibOP77yqN4yhKwjCGg7VTKRys1Cpg4j5o QAUqXcqusA9UD+XVV3UYJaMxRucq+0hdfxCW4NKVE0l/Iyy3tc/l5U541gvM7tsSOZl1XhTGPgnm /An5hRUgj6ECT30SSpm0B79+tjMrQKC94ciH7a+bIZhTw26+M2X+Rvkb497Cr6yk7Y0rLpU+t/qA omjnH8qizXuQHlSErxevPX9ewiUB/05uoeO+nz9cu4tfAAAA//8DAFBLAwQUAAYACAAAACEAR+Dj aeEAAAAMAQAADwAAAGRycy9kb3ducmV2LnhtbEyPwWqDQBCG74W+wzKF3prVSGxjXEMIbU+hkKRQ cpvoRCXurLgbNW/f9dTeZvg//vkmXY+6ET11tjasIJwFIIhzU9RcKvg+fry8gbAOucDGMCm4k4V1 9viQYlKYgffUH1wpfAnbBBVUzrWJlDavSKOdmZbYZxfTaXR+7UpZdDj4ct3IeRDEUmPN/kKFLW0r yq+Hm1bwOeCwicL3fne9bO+n4+LrZxeSUs9P42YFwtHo/mCY9L06ZN7pbG5cWNEoiMMo8qiCxet8 CWIigjjy03nK4iXILJX/n8h+AQAA//8DAFBLAQItABQABgAIAAAAIQC2gziS/gAAAOEBAAATAAAA AAAAAAAAAAAAAAAAAABbQ29udGVudF9UeXBlc10ueG1sUEsBAi0AFAAGAAgAAAAhADj9If/WAAAA lAEAAAsAAAAAAAAAAAAAAAAALwEAAF9yZWxzLy5yZWxzUEsBAi0AFAAGAAgAAAAhAOnEE0MmAwAA vgcAAA4AAAAAAAAAAAAAAAAALgIAAGRycy9lMm9Eb2MueG1sUEsBAi0AFAAGAAgAAAAhAEfg42nh AAAADAEAAA8AAAAAAAAAAAAAAAAAgAUAAGRycy9kb3ducmV2LnhtbFBLBQYAAAAABAAEAPMAAACO BgAAAAA= ">
-                <v:shape id="Cuadro de texto 2" o:spid="_x0000_s1045" type="#_x0000_t202" style="position:absolute;top:397;width:28454;height:2400;visibility:visible;mso-wrap-style:square;v-text-anchor:top" o:gfxdata="UEsDBBQABgAIAAAAIQDb4fbL7gAAAIUBAAATAAAAW0NvbnRlbnRfVHlwZXNdLnhtbHyQz07DMAyH 70i8Q+QralM4IITa7kDhCAiNB7ASt43WOlEcyvb2pNu4IODoPz9/n1xv9vOkForiPDdwXVagiI23 jocG3rdPxR0oScgWJ8/UwIEENu3lRb09BBKV0ywNjCmFe63FjDSjlD4Q50nv44wpl3HQAc0OB9I3 VXWrjedEnIq03oC27qjHjympx31un0wiTQLq4bS4shrAECZnMGVTvbD9QSnOhDInjzsyuiBXWQP0 r4R18jfgnHvJr4nOknrFmJ5xzhraRtHWf3Kkpfz/yGo5S+H73hkquyhdjr3R8m2lj09svwAAAP// AwBQSwMEFAAGAAgAAAAhAFr0LFu/AAAAFQEAAAsAAABfcmVscy8ucmVsc2zPwWrDMAwG4Ptg72B0 X5TuUMaI01uh19I+gLGVxCy2jGSy9e1nemrHjpL4P0nD4SetZiPRyNnCruvBUPYcYp4tXC/Htw8w Wl0ObuVMFm6kcBhfX4Yzra62kC6xqGlKVgtLreUTUf1CyWnHhXKbTCzJ1VbKjMX5LzcTvvf9HuXR gPHJNKdgQU5hB+ZyK23zHztFL6w81c5zQp6m6P9TMfB3PtPWFCczVQtB9N4U2rp2HOA44NMz4y8A AAD//wMAUEsDBBQABgAIAAAAIQAAIe3vyQAAAOIAAAAPAAAAZHJzL2Rvd25yZXYueG1sRI/NasJA FIX3gu8wXKE7nWhs0NRRpFAQcVFtF11eMreZNJk7aWbU+PadguDycH4+zmrT20ZcqPOVYwXTSQKC uHC64lLB58fbeAHCB2SNjWNScCMPm/VwsMJcuysf6XIKpYgj7HNUYEJocyl9Yciin7iWOHrfrrMY ouxKqTu8xnHbyFmSZNJixZFgsKVXQ0V9OtsIOfjifHS/P9NDLb9MneHzu9kr9TTqty8gAvXhEb63 d1rBIkuX2TJN5/B/Kd4Buf4DAAD//wMAUEsBAi0AFAAGAAgAAAAhANvh9svuAAAAhQEAABMAAAAA AAAAAAAAAAAAAAAAAFtDb250ZW50X1R5cGVzXS54bWxQSwECLQAUAAYACAAAACEAWvQsW78AAAAV AQAACwAAAAAAAAAAAAAAAAAfAQAAX3JlbHMvLnJlbHNQSwECLQAUAAYACAAAACEAACHt78kAAADi AAAADwAAAAAAAAAAAAAAAAAHAgAAZHJzL2Rvd25yZXYueG1sUEsFBgAAAAADAAMAtwAAAP0CAAAA AA== " stroked="f">
+              <v:group w14:anchorId="3D3E9F9D" id="_x0000_s1044" style="position:absolute;left:0;text-align:left;margin-left:306.65pt;margin-top:286.45pt;width:225.3pt;height:22pt;z-index:487620608;mso-position-horizontal-relative:page;mso-position-vertical-relative:text;mso-height-relative:margin" coordsize="28613,2797" o:gfxdata="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">
+                <v:shape id="Cuadro de texto 2" o:spid="_x0000_s1045" type="#_x0000_t202" style="position:absolute;top:397;width:28454;height:2400;visibility:visible;mso-wrap-style:square;v-text-anchor:top" o:gfxdata="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" stroked="f">
                   <v:textbox style="mso-fit-shape-to-text:t">
                     <w:txbxContent>
                       <w:p>
@@ -18919,7 +18919,7 @@
                     </w:txbxContent>
                   </v:textbox>
                 </v:shape>
-                <v:line id="Conector recto 10" o:spid="_x0000_s1046" style="position:absolute;visibility:visible;mso-wrap-style:square" from="159,0" to="28613,0" o:connectortype="straight" o:gfxdata="UEsDBBQABgAIAAAAIQDb4fbL7gAAAIUBAAATAAAAW0NvbnRlbnRfVHlwZXNdLnhtbHyQz07DMAyH 70i8Q+QralM4IITa7kDhCAiNB7ASt43WOlEcyvb2pNu4IODoPz9/n1xv9vOkForiPDdwXVagiI23 jocG3rdPxR0oScgWJ8/UwIEENu3lRb09BBKV0ywNjCmFe63FjDSjlD4Q50nv44wpl3HQAc0OB9I3 VXWrjedEnIq03oC27qjHjympx31un0wiTQLq4bS4shrAECZnMGVTvbD9QSnOhDInjzsyuiBXWQP0 r4R18jfgnHvJr4nOknrFmJ5xzhraRtHWf3Kkpfz/yGo5S+H73hkquyhdjr3R8m2lj09svwAAAP// AwBQSwMEFAAGAAgAAAAhAFr0LFu/AAAAFQEAAAsAAABfcmVscy8ucmVsc2zPwWrDMAwG4Ptg72B0 X5TuUMaI01uh19I+gLGVxCy2jGSy9e1nemrHjpL4P0nD4SetZiPRyNnCruvBUPYcYp4tXC/Htw8w Wl0ObuVMFm6kcBhfX4Yzra62kC6xqGlKVgtLreUTUf1CyWnHhXKbTCzJ1VbKjMX5LzcTvvf9HuXR gPHJNKdgQU5hB+ZyK23zHztFL6w81c5zQp6m6P9TMfB3PtPWFCczVQtB9N4U2rp2HOA44NMz4y8A AAD//wMAUEsDBBQABgAIAAAAIQAuUlAZxwAAAOIAAAAPAAAAZHJzL2Rvd25yZXYueG1sRE/PS8Mw FL4L/g/hCd5c2kGXrS4bZTBwenIquz6aZ1ttXkqSdZ1/vTkIHj++3+vtZHsxkg+dYw35LANBXDvT caPh/W3/sAQRIrLB3jFpuFKA7eb2Zo2lcRd+pfEYG5FCOJSooY1xKKUMdUsWw8wNxIn7dN5iTNA3 0ni8pHDby3mWLaTFjlNDiwPtWqq/j2erYVk/f/lKVYe8+BjUzzh/WexPSuv7u6l6BBFpiv/iP/eT 0aBUUazyXKXN6VK6A3LzCwAA//8DAFBLAQItABQABgAIAAAAIQDb4fbL7gAAAIUBAAATAAAAAAAA AAAAAAAAAAAAAABbQ29udGVudF9UeXBlc10ueG1sUEsBAi0AFAAGAAgAAAAhAFr0LFu/AAAAFQEA AAsAAAAAAAAAAAAAAAAAHwEAAF9yZWxzLy5yZWxzUEsBAi0AFAAGAAgAAAAhAC5SUBnHAAAA4gAA AA8AAAAAAAAAAAAAAAAABwIAAGRycy9kb3ducmV2LnhtbFBLBQYAAAAAAwADALcAAAD7AgAAAAA= " strokecolor="black [3213]"/>
+                <v:line id="Conector recto 10" o:spid="_x0000_s1046" style="position:absolute;visibility:visible;mso-wrap-style:square" from="159,0" to="28613,0" o:connectortype="straight" o:gfxdata="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" strokecolor="black [3213]"/>
                 <w10:wrap anchorx="page"/>
               </v:group>
             </w:pict>
@@ -19087,8 +19087,8 @@
           </mc:Choice>
           <mc:Fallback>
             <w:pict>
-              <v:group w14:anchorId="75629FBE" id="_x0000_s1047" style="position:absolute;left:0;text-align:left;margin-left:60.65pt;margin-top:286.7pt;width:225.3pt;height:44pt;z-index:487619584;mso-position-horizontal-relative:page;mso-position-vertical-relative:text;mso-height-relative:margin" coordsize="28613,5598" o:gfxdata="UEsDBBQABgAIAAAAIQC2gziS/gAAAOEBAAATAAAAW0NvbnRlbnRfVHlwZXNdLnhtbJSRQU7DMBBF 90jcwfIWJU67QAgl6YK0S0CoHGBkTxKLZGx5TGhvj5O2G0SRWNoz/78nu9wcxkFMGNg6quQqL6RA 0s5Y6ir5vt9lD1JwBDIwOMJKHpHlpr69KfdHjyxSmriSfYz+USnWPY7AufNIadK6MEJMx9ApD/oD OlTrorhX2lFEilmcO2RdNtjC5xDF9pCuTyYBB5bi6bQ4syoJ3g9WQ0ymaiLzg5KdCXlKLjvcW893 SUOqXwnz5DrgnHtJTxOsQfEKIT7DmDSUCaxw7Rqn8787ZsmRM9e2VmPeBN4uqYvTtW7jvijg9N/y JsXecLq0q+WD6m8AAAD//wMAUEsDBBQABgAIAAAAIQA4/SH/1gAAAJQBAAALAAAAX3JlbHMvLnJl bHOkkMFqwzAMhu+DvYPRfXGawxijTi+j0GvpHsDYimMaW0Yy2fr2M4PBMnrbUb/Q94l/f/hMi1qR JVI2sOt6UJgd+ZiDgffL8ekFlFSbvV0oo4EbChzGx4f9GRdb25HMsYhqlCwG5lrLq9biZkxWOiqY 22YiTra2kYMu1l1tQD30/bPm3wwYN0x18gb45AdQl1tp5j/sFB2T0FQ7R0nTNEV3j6o9feQzro1i OWA14Fm+Q8a1a8+Bvu/d/dMb2JY5uiPbhG/ktn4cqGU/er3pcvwCAAD//wMAUEsDBBQABgAIAAAA IQBNvPC4KgMAAL8HAAAOAAAAZHJzL2Uyb0RvYy54bWy0Vdly2yAUfe9M/4HhvZElW140kTOpE2c6 0yXTtB+AEVqmCFTAltyv7wVtduI+NJ3qQQLBPVzOPQeub5qSowNTupAixv7VBCMmqEwKkcX4+7ft uyVG2hCREC4Fi/GRaXyzfvvmuq4iFshc8oQpBCBCR3UV49yYKvI8TXNWEn0lKyZgMJWqJAa6KvMS RWpAL7kXTCZzr5YqqZSkTGv4e9cO4rXDT1NGzZc01cwgHmPIzbi3cu+dfXvraxJlilR5Qbs0yCuy KEkhYNEB6o4YgvaqeAFVFlRJLVNzRWXpyTQtKHN7gN34k2e7eVByX7m9ZFGdVQNNQO0znl4NSz8f HlT1VD0qYKKuMuDC9exemlSV9gtZosZRdhwoY41BFH4Gy7k/9YFZCmNhuFxOOk5pDsS/CKP5/Wng dNEHrpYL3xbD65f1zpKpK5CHHhnQ/8bAU04q5ojVETDwqFCRgHr90J8Hs6UfYCRICWrd7EmiJEoY MrBhiQKbos0FgixnyDTvJbDgu9rr6qOkPzQScpMTkbFbpWSdM5JAtu3mTkJbHG1BdvUnmcBqZG+k A7pI/HS1CMJWryP5s3A29zsOQUCz+RmHJKqUNg9Mlsg2YqzAD24FcvioTUt3P8VWWkteJNuCc9dR 2W7DFToQ8M7WPR362TQuUB3jVQjJ2SghbTxAk6gsDHibF2WMQRbwtNlbRu5F4qYYUvC2DYXnAupv KbKstPyYZtd0tbHBdnAnkyOQpmTrZTh7oJFL9QujGnwcY/1zTxTDiH8QQPzKn82s8V1nFi4C6KjT kd3pCBEUoGJsMGqbG+MOC8dHdQsF2haOtzGTLmdQZ5vff5cpWGU1DxYrqHunUjhZqZHAif0gcGNH Fah0Izpn96z2/hps7YerCQj+krVBXdOwVZfDHMz5Qli8ENZPJPqDsGxpn8vLHvFsEJhpev+fqOuy KLQ5cmbxuPjKUpDH6MBzTEIpE6bHdbNtWAoCHQInLm1334zJnAd2820oc1fK3wQPEW5lKcwQXBZC qkurj1Sk7fzeFu2+R+lBmZ1fnPbcgQm3BPw7u4ZO+27+eO+ufwMAAP//AwBQSwMEFAAGAAgAAAAh ADEcHeviAAAACwEAAA8AAABkcnMvZG93bnJldi54bWxMj8FOwzAQRO9I/IO1SNyo46ZJS4hTVRVw qpBokSpubrxNosbrKHaT9O8xJziO9mnmbb6eTMsG7F1jSYKYRcCQSqsbqiR8Hd6eVsCcV6RVawkl 3NDBuri/y1Wm7UifOOx9xUIJuUxJqL3vMs5dWaNRbmY7pHA7294oH2Jfcd2rMZSbls+jKOVGNRQW atXhtsbysr8aCe+jGjexeB12l/P29n1IPo47gVI+PkybF2AeJ/8Hw69+UIciOJ3slbRjbchzEQdU QrKMF8ACkSzFM7CThDQVC+BFzv//UPwAAAD//wMAUEsBAi0AFAAGAAgAAAAhALaDOJL+AAAA4QEA ABMAAAAAAAAAAAAAAAAAAAAAAFtDb250ZW50X1R5cGVzXS54bWxQSwECLQAUAAYACAAAACEAOP0h /9YAAACUAQAACwAAAAAAAAAAAAAAAAAvAQAAX3JlbHMvLnJlbHNQSwECLQAUAAYACAAAACEATbzw uCoDAAC/BwAADgAAAAAAAAAAAAAAAAAuAgAAZHJzL2Uyb0RvYy54bWxQSwECLQAUAAYACAAAACEA MRwd6+IAAAALAQAADwAAAAAAAAAAAAAAAACEBQAAZHJzL2Rvd25yZXYueG1sUEsFBgAAAAAEAAQA 8wAAAJMGAAAAAA== ">
-                <v:shape id="Cuadro de texto 2" o:spid="_x0000_s1048" type="#_x0000_t202" style="position:absolute;top:397;width:28454;height:5201;visibility:visible;mso-wrap-style:square;v-text-anchor:top" o:gfxdata="UEsDBBQABgAIAAAAIQDb4fbL7gAAAIUBAAATAAAAW0NvbnRlbnRfVHlwZXNdLnhtbHyQz07DMAyH 70i8Q+QralM4IITa7kDhCAiNB7ASt43WOlEcyvb2pNu4IODoPz9/n1xv9vOkForiPDdwXVagiI23 jocG3rdPxR0oScgWJ8/UwIEENu3lRb09BBKV0ywNjCmFe63FjDSjlD4Q50nv44wpl3HQAc0OB9I3 VXWrjedEnIq03oC27qjHjympx31un0wiTQLq4bS4shrAECZnMGVTvbD9QSnOhDInjzsyuiBXWQP0 r4R18jfgnHvJr4nOknrFmJ5xzhraRtHWf3Kkpfz/yGo5S+H73hkquyhdjr3R8m2lj09svwAAAP// AwBQSwMEFAAGAAgAAAAhAFr0LFu/AAAAFQEAAAsAAABfcmVscy8ucmVsc2zPwWrDMAwG4Ptg72B0 X5TuUMaI01uh19I+gLGVxCy2jGSy9e1nemrHjpL4P0nD4SetZiPRyNnCruvBUPYcYp4tXC/Htw8w Wl0ObuVMFm6kcBhfX4Yzra62kC6xqGlKVgtLreUTUf1CyWnHhXKbTCzJ1VbKjMX5LzcTvvf9HuXR gPHJNKdgQU5hB+ZyK23zHztFL6w81c5zQp6m6P9TMfB3PtPWFCczVQtB9N4U2rp2HOA44NMz4y8A AAD//wMAUEsDBBQABgAIAAAAIQAwzsMsygAAAOMAAAAPAAAAZHJzL2Rvd25yZXYueG1sRI9Ba8JA EIXvQv/DMkJvutlQg6SuIgWhFA/V9tDjkB2zMdnZmF01/ffdQqHHmffmfW9Wm9F14kZDaDxrUPMM BHHlTcO1hs+P3WwJIkRkg51n0vBNATbrh8kKS+PvfKDbMdYihXAoUYONsS+lDJUlh2Hue+Kknfzg MKZxqKUZ8J7CXSfzLCukw4YTwWJPL5aq9nh1CbIP1fXgL2e1b+WXbQtcvNs3rR+n4/YZRKQx/pv/ rl9Nqq8WqsifliqH35/SAuT6BwAA//8DAFBLAQItABQABgAIAAAAIQDb4fbL7gAAAIUBAAATAAAA AAAAAAAAAAAAAAAAAABbQ29udGVudF9UeXBlc10ueG1sUEsBAi0AFAAGAAgAAAAhAFr0LFu/AAAA FQEAAAsAAAAAAAAAAAAAAAAAHwEAAF9yZWxzLy5yZWxzUEsBAi0AFAAGAAgAAAAhADDOwyzKAAAA 4wAAAA8AAAAAAAAAAAAAAAAABwIAAGRycy9kb3ducmV2LnhtbFBLBQYAAAAAAwADALcAAAD+AgAA AAA= " stroked="f">
+              <v:group w14:anchorId="75629FBE" id="_x0000_s1047" style="position:absolute;left:0;text-align:left;margin-left:60.65pt;margin-top:286.7pt;width:225.3pt;height:44pt;z-index:487619584;mso-position-horizontal-relative:page;mso-position-vertical-relative:text;mso-height-relative:margin" coordsize="28613,5598" o:gfxdata="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">
+                <v:shape id="Cuadro de texto 2" o:spid="_x0000_s1048" type="#_x0000_t202" style="position:absolute;top:397;width:28454;height:5201;visibility:visible;mso-wrap-style:square;v-text-anchor:top" o:gfxdata="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" stroked="f">
                   <v:textbox style="mso-fit-shape-to-text:t">
                     <w:txbxContent>
                       <w:p>
@@ -19146,7 +19146,7 @@
                     </w:txbxContent>
                   </v:textbox>
                 </v:shape>
-                <v:line id="Conector recto 10" o:spid="_x0000_s1049" style="position:absolute;visibility:visible;mso-wrap-style:square" from="159,0" to="28613,0" o:connectortype="straight" o:gfxdata="UEsDBBQABgAIAAAAIQDb4fbL7gAAAIUBAAATAAAAW0NvbnRlbnRfVHlwZXNdLnhtbHyQz07DMAyH 70i8Q+QralM4IITa7kDhCAiNB7ASt43WOlEcyvb2pNu4IODoPz9/n1xv9vOkForiPDdwXVagiI23 jocG3rdPxR0oScgWJ8/UwIEENu3lRb09BBKV0ywNjCmFe63FjDSjlD4Q50nv44wpl3HQAc0OB9I3 VXWrjedEnIq03oC27qjHjympx31un0wiTQLq4bS4shrAECZnMGVTvbD9QSnOhDInjzsyuiBXWQP0 r4R18jfgnHvJr4nOknrFmJ5xzhraRtHWf3Kkpfz/yGo5S+H73hkquyhdjr3R8m2lj09svwAAAP// AwBQSwMEFAAGAAgAAAAhAFr0LFu/AAAAFQEAAAsAAABfcmVscy8ucmVsc2zPwWrDMAwG4Ptg72B0 X5TuUMaI01uh19I+gLGVxCy2jGSy9e1nemrHjpL4P0nD4SetZiPRyNnCruvBUPYcYp4tXC/Htw8w Wl0ObuVMFm6kcBhfX4Yzra62kC6xqGlKVgtLreUTUf1CyWnHhXKbTCzJ1VbKjMX5LzcTvvf9HuXR gPHJNKdgQU5hB+ZyK23zHztFL6w81c5zQp6m6P9TMfB3PtPWFCczVQtB9N4U2rp2HOA44NMz4y8A AAD//wMAUEsDBBQABgAIAAAAIQCB/OHTywAAAOIAAAAPAAAAZHJzL2Rvd25yZXYueG1sRI/NasMw EITvhbyD2EBvjWxDLduJEkwg0J9T05ZeF2tju7UkIymO26evCoUch5n5htnsZj2wiZzvrZGQrhJg ZBqretNKeHs93BXAfECjcLCGJHyTh912cbPBStmLeaHpGFoWIcZXKKELYaw4901HGv3KjmSid7JO Y4jStVw5vES4HniWJDnX2Ju40OFI+46ar+NZSyiap09Xi/oxvX8fxc+UPeeHDyHl7XKu18ACzeEa /m8/KAllIco8E2UKf5fiHeDbXwAAAP//AwBQSwECLQAUAAYACAAAACEA2+H2y+4AAACFAQAAEwAA AAAAAAAAAAAAAAAAAAAAW0NvbnRlbnRfVHlwZXNdLnhtbFBLAQItABQABgAIAAAAIQBa9CxbvwAA ABUBAAALAAAAAAAAAAAAAAAAAB8BAABfcmVscy8ucmVsc1BLAQItABQABgAIAAAAIQCB/OHTywAA AOIAAAAPAAAAAAAAAAAAAAAAAAcCAABkcnMvZG93bnJldi54bWxQSwUGAAAAAAMAAwC3AAAA/wIA AAAA " strokecolor="black [3213]"/>
+                <v:line id="Conector recto 10" o:spid="_x0000_s1049" style="position:absolute;visibility:visible;mso-wrap-style:square" from="159,0" to="28613,0" o:connectortype="straight" o:gfxdata="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" strokecolor="black [3213]"/>
                 <w10:wrap anchorx="page"/>
               </v:group>
             </w:pict>
@@ -22125,8 +22125,8 @@
           </mc:Choice>
           <mc:Fallback>
             <w:pict>
-              <v:group w14:anchorId="3F34E303" id="_x0000_s1050" style="position:absolute;left:0;text-align:left;margin-left:60.9pt;margin-top:204.2pt;width:225.3pt;height:44pt;z-index:487622656;mso-position-horizontal-relative:page;mso-position-vertical-relative:text;mso-height-relative:margin" coordsize="28613,5598" o:gfxdata="UEsDBBQABgAIAAAAIQC2gziS/gAAAOEBAAATAAAAW0NvbnRlbnRfVHlwZXNdLnhtbJSRQU7DMBBF 90jcwfIWJU67QAgl6YK0S0CoHGBkTxKLZGx5TGhvj5O2G0SRWNoz/78nu9wcxkFMGNg6quQqL6RA 0s5Y6ir5vt9lD1JwBDIwOMJKHpHlpr69KfdHjyxSmriSfYz+USnWPY7AufNIadK6MEJMx9ApD/oD OlTrorhX2lFEilmcO2RdNtjC5xDF9pCuTyYBB5bi6bQ4syoJ3g9WQ0ymaiLzg5KdCXlKLjvcW893 SUOqXwnz5DrgnHtJTxOsQfEKIT7DmDSUCaxw7Rqn8787ZsmRM9e2VmPeBN4uqYvTtW7jvijg9N/y JsXecLq0q+WD6m8AAAD//wMAUEsDBBQABgAIAAAAIQA4/SH/1gAAAJQBAAALAAAAX3JlbHMvLnJl bHOkkMFqwzAMhu+DvYPRfXGawxijTi+j0GvpHsDYimMaW0Yy2fr2M4PBMnrbUb/Q94l/f/hMi1qR JVI2sOt6UJgd+ZiDgffL8ekFlFSbvV0oo4EbChzGx4f9GRdb25HMsYhqlCwG5lrLq9biZkxWOiqY 22YiTra2kYMu1l1tQD30/bPm3wwYN0x18gb45AdQl1tp5j/sFB2T0FQ7R0nTNEV3j6o9feQzro1i OWA14Fm+Q8a1a8+Bvu/d/dMb2JY5uiPbhG/ktn4cqGU/er3pcvwCAAD//wMAUEsDBBQABgAIAAAA IQBpqNJYKwMAAMAHAAAOAAAAZHJzL2Uyb0RvYy54bWy8lVtv2yAUx98n7Tsg3ldfYudi1am6tKkm 7VKt2wcgGF80DB6Q2Nmn3wE7TtJmD+uk5cExhnM4/Pj/4fqmqznaMaUrKVIcXPkYMUFlVokixd+/ rd/NMdKGiIxwKViK90zjm+XbN9dtk7BQlpJnTCFIInTSNikujWkSz9O0ZDXRV7JhAjpzqWpioKkK L1Okhew190Lfn3qtVFmjJGVaw9e7vhMvXf48Z9R8yXPNDOIphtqMeyr33Nint7wmSaFIU1Z0KIO8 ooqaVAImHVPdEUPQVlUvUtUVVVLL3FxRWXsyzyvK3BpgNYH/bDUPSm4bt5YiaYtmxARon3F6dVr6 efegmqfmUQGJtimAhWvZtXS5qu0/VIk6h2w/ImOdQRQ+hvNpMAmALIW+OJ7P/YEpLQH8izBa3p8G TmaHwMV8FtjN8A7TemfFtA3IQx8J6H8j8FSShjmwOgECjwpVGah3PvGnkyhaRBgJUoNaV1uSKYky hgwsWKLQlmhrgSDLDJnuvQQKgdt73XyU9IdGQq5KIgp2q5RsS0YyqLZf3Elon0fbJJv2k8xgNrI1 0iW6CH6ymIVxr9cj/CiOpsHAEAQUTc8YkqRR2jwwWSP7kmIFfnAzkN1HbXrchyF2p7XkVbauOHcN VWxWXKEdAe+s3W/IfjaMC9SmeBFDcTZKSBsPqUlSVwa8zas6xSAL+PXVWyL3InNDDKl4/w4bzwXs v0VkqfR8TLfp+r0Z0W9ktgdoSvZehrMHXkqpfmHUgo9TrH9uiWIY8Q8CwC+CKLLGd40onoXQUKc9 m9MeIiikSrHBqH9dGXdYOB7NLWzQunLcbJl9JUPNoM6+5P8g0zhczOOpD+YZZApHKzUSoNg/BHY8 ynQlBmsfsB4MNvo6iBd+iNElb4O8JnEvL5dzdOcLZfFKWEOR5A/Ksnv7XF/2jGejwkx3OABO5HVZ FdrsObP5uPjKctDH0YLnOQmlTJhDXjfahuWg0DHQd2W7C+dYzHngMN6GMnen/E3wGOFmlsKMwXUl pLo0+xFF3o8/+KJf91F71sG25cTnTky4JuDb2T102nbjjxfv8jcAAAD//wMAUEsDBBQABgAIAAAA IQDmVi5o4QAAAAsBAAAPAAAAZHJzL2Rvd25yZXYueG1sTI9BT8MwDIXvSPyHyEjcWNrSjVGaTtME nKZJbEiIm9d4bbUmqZqs7f495gQ3P/vp+Xv5ajKtGKj3jbMK4lkEgmzpdGMrBZ+Ht4clCB/Qamyd JQVX8rAqbm9yzLQb7QcN+1AJDrE+QwV1CF0mpS9rMuhnriPLt5PrDQaWfSV1jyOHm1YmUbSQBhvL H2rsaFNTed5fjIL3Ecf1Y/w6bM+nzfX7MN99bWNS6v5uWr+ACDSFPzP84jM6FMx0dBervWhZJzGj BwVptExBsGP+lPBw5M3zIgVZ5PJ/h+IHAAD//wMAUEsBAi0AFAAGAAgAAAAhALaDOJL+AAAA4QEA ABMAAAAAAAAAAAAAAAAAAAAAAFtDb250ZW50X1R5cGVzXS54bWxQSwECLQAUAAYACAAAACEAOP0h /9YAAACUAQAACwAAAAAAAAAAAAAAAAAvAQAAX3JlbHMvLnJlbHNQSwECLQAUAAYACAAAACEAaajS WCsDAADABwAADgAAAAAAAAAAAAAAAAAuAgAAZHJzL2Uyb0RvYy54bWxQSwECLQAUAAYACAAAACEA 5lYuaOEAAAALAQAADwAAAAAAAAAAAAAAAACFBQAAZHJzL2Rvd25yZXYueG1sUEsFBgAAAAAEAAQA 8wAAAJMGAAAAAA== ">
-                <v:shape id="Cuadro de texto 2" o:spid="_x0000_s1051" type="#_x0000_t202" style="position:absolute;top:397;width:28454;height:5201;visibility:visible;mso-wrap-style:square;v-text-anchor:top" o:gfxdata="UEsDBBQABgAIAAAAIQDb4fbL7gAAAIUBAAATAAAAW0NvbnRlbnRfVHlwZXNdLnhtbHyQz07DMAyH 70i8Q+QralM4IITa7kDhCAiNB7ASt43WOlEcyvb2pNu4IODoPz9/n1xv9vOkForiPDdwXVagiI23 jocG3rdPxR0oScgWJ8/UwIEENu3lRb09BBKV0ywNjCmFe63FjDSjlD4Q50nv44wpl3HQAc0OB9I3 VXWrjedEnIq03oC27qjHjympx31un0wiTQLq4bS4shrAECZnMGVTvbD9QSnOhDInjzsyuiBXWQP0 r4R18jfgnHvJr4nOknrFmJ5xzhraRtHWf3Kkpfz/yGo5S+H73hkquyhdjr3R8m2lj09svwAAAP// AwBQSwMEFAAGAAgAAAAhAFr0LFu/AAAAFQEAAAsAAABfcmVscy8ucmVsc2zPwWrDMAwG4Ptg72B0 X5TuUMaI01uh19I+gLGVxCy2jGSy9e1nemrHjpL4P0nD4SetZiPRyNnCruvBUPYcYp4tXC/Htw8w Wl0ObuVMFm6kcBhfX4Yzra62kC6xqGlKVgtLreUTUf1CyWnHhXKbTCzJ1VbKjMX5LzcTvvf9HuXR gPHJNKdgQU5hB+ZyK23zHztFL6w81c5zQp6m6P9TMfB3PtPWFCczVQtB9N4U2rp2HOA44NMz4y8A AAD//wMAUEsDBBQABgAIAAAAIQAH6FKXywAAAOMAAAAPAAAAZHJzL2Rvd25yZXYueG1sRI9Ba8JA EIXvQv/DMkJvurHGoNFViiCU4kFtDx6H7JiNyc6m2VXTf98tFHqceW/e92a16W0j7tT5yrGCyTgB QVw4XXGp4PNjN5qD8AFZY+OYFHyTh836abDCXLsHH+l+CqWIIexzVGBCaHMpfWHIoh+7ljhqF9dZ DHHsSqk7fMRw28iXJMmkxYojwWBLW0NFfbrZCNn74nZ0X9fJvpZnU2c4O5h3pZ6H/esSRKA+/Jv/ rt90rD+fJtk0TRcp/P4UFyDXPwAAAP//AwBQSwECLQAUAAYACAAAACEA2+H2y+4AAACFAQAAEwAA AAAAAAAAAAAAAAAAAAAAW0NvbnRlbnRfVHlwZXNdLnhtbFBLAQItABQABgAIAAAAIQBa9CxbvwAA ABUBAAALAAAAAAAAAAAAAAAAAB8BAABfcmVscy8ucmVsc1BLAQItABQABgAIAAAAIQAH6FKXywAA AOMAAAAPAAAAAAAAAAAAAAAAAAcCAABkcnMvZG93bnJldi54bWxQSwUGAAAAAAMAAwC3AAAA/wIA AAAA " stroked="f">
+              <v:group w14:anchorId="3F34E303" id="_x0000_s1050" style="position:absolute;left:0;text-align:left;margin-left:60.9pt;margin-top:204.2pt;width:225.3pt;height:44pt;z-index:487622656;mso-position-horizontal-relative:page;mso-position-vertical-relative:text;mso-height-relative:margin" coordsize="28613,5598" o:gfxdata="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">
+                <v:shape id="Cuadro de texto 2" o:spid="_x0000_s1051" type="#_x0000_t202" style="position:absolute;top:397;width:28454;height:5201;visibility:visible;mso-wrap-style:square;v-text-anchor:top" o:gfxdata="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" stroked="f">
                   <v:textbox style="mso-fit-shape-to-text:t">
                     <w:txbxContent>
                       <w:p>
@@ -22184,7 +22184,7 @@
                     </w:txbxContent>
                   </v:textbox>
                 </v:shape>
-                <v:line id="Conector recto 10" o:spid="_x0000_s1052" style="position:absolute;visibility:visible;mso-wrap-style:square" from="159,0" to="28613,0" o:connectortype="straight" o:gfxdata="UEsDBBQABgAIAAAAIQDb4fbL7gAAAIUBAAATAAAAW0NvbnRlbnRfVHlwZXNdLnhtbHyQz07DMAyH 70i8Q+QralM4IITa7kDhCAiNB7ASt43WOlEcyvb2pNu4IODoPz9/n1xv9vOkForiPDdwXVagiI23 jocG3rdPxR0oScgWJ8/UwIEENu3lRb09BBKV0ywNjCmFe63FjDSjlD4Q50nv44wpl3HQAc0OB9I3 VXWrjedEnIq03oC27qjHjympx31un0wiTQLq4bS4shrAECZnMGVTvbD9QSnOhDInjzsyuiBXWQP0 r4R18jfgnHvJr4nOknrFmJ5xzhraRtHWf3Kkpfz/yGo5S+H73hkquyhdjr3R8m2lj09svwAAAP// AwBQSwMEFAAGAAgAAAAhAFr0LFu/AAAAFQEAAAsAAABfcmVscy8ucmVsc2zPwWrDMAwG4Ptg72B0 X5TuUMaI01uh19I+gLGVxCy2jGSy9e1nemrHjpL4P0nD4SetZiPRyNnCruvBUPYcYp4tXC/Htw8w Wl0ObuVMFm6kcBhfX4Yzra62kC6xqGlKVgtLreUTUf1CyWnHhXKbTCzJ1VbKjMX5LzcTvvf9HuXR gPHJNKdgQU5hB+ZyK23zHztFL6w81c5zQp6m6P9TMfB3PtPWFCczVQtB9N4U2rp2HOA44NMz4y8A AAD//wMAUEsDBBQABgAIAAAAIQCECuvRyAAAAOMAAAAPAAAAZHJzL2Rvd25yZXYueG1sRE9LS8NA EL4L/Q/LFLzZTQN5GLstoVDwcbIqXofsmMRmZ8PumkZ/vSsIPc73ns1uNoOYyPnesoL1KgFB3Fjd c6vg9eVwU4LwAVnjYJkUfJOH3XZxtcFK2zM/03QMrYgh7CtU0IUwVlL6piODfmVH4sh9WGcwxNO1 Ujs8x3AzyDRJcmmw59jQ4Uj7jprT8csoKJvHT1cX9cM6exuLnyl9yg/vhVLXy7m+AxFoDhfxv/te x/lllt6WWZ4U8PdTBEBufwEAAP//AwBQSwECLQAUAAYACAAAACEA2+H2y+4AAACFAQAAEwAAAAAA AAAAAAAAAAAAAAAAW0NvbnRlbnRfVHlwZXNdLnhtbFBLAQItABQABgAIAAAAIQBa9CxbvwAAABUB AAALAAAAAAAAAAAAAAAAAB8BAABfcmVscy8ucmVsc1BLAQItABQABgAIAAAAIQCECuvRyAAAAOMA AAAPAAAAAAAAAAAAAAAAAAcCAABkcnMvZG93bnJldi54bWxQSwUGAAAAAAMAAwC3AAAA/AIAAAAA " strokecolor="black [3213]"/>
+                <v:line id="Conector recto 10" o:spid="_x0000_s1052" style="position:absolute;visibility:visible;mso-wrap-style:square" from="159,0" to="28613,0" o:connectortype="straight" o:gfxdata="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" strokecolor="black [3213]"/>
                 <w10:wrap anchorx="page"/>
               </v:group>
             </w:pict>
@@ -22316,8 +22316,8 @@
           </mc:Choice>
           <mc:Fallback>
             <w:pict>
-              <v:group w14:anchorId="71397554" id="_x0000_s1053" style="position:absolute;left:0;text-align:left;margin-left:306.9pt;margin-top:203.95pt;width:225.3pt;height:22pt;z-index:487623680;mso-position-horizontal-relative:page;mso-position-vertical-relative:text;mso-height-relative:margin" coordsize="28613,2797" o:gfxdata="UEsDBBQABgAIAAAAIQC2gziS/gAAAOEBAAATAAAAW0NvbnRlbnRfVHlwZXNdLnhtbJSRQU7DMBBF 90jcwfIWJU67QAgl6YK0S0CoHGBkTxKLZGx5TGhvj5O2G0SRWNoz/78nu9wcxkFMGNg6quQqL6RA 0s5Y6ir5vt9lD1JwBDIwOMJKHpHlpr69KfdHjyxSmriSfYz+USnWPY7AufNIadK6MEJMx9ApD/oD OlTrorhX2lFEilmcO2RdNtjC5xDF9pCuTyYBB5bi6bQ4syoJ3g9WQ0ymaiLzg5KdCXlKLjvcW893 SUOqXwnz5DrgnHtJTxOsQfEKIT7DmDSUCaxw7Rqn8787ZsmRM9e2VmPeBN4uqYvTtW7jvijg9N/y JsXecLq0q+WD6m8AAAD//wMAUEsDBBQABgAIAAAAIQA4/SH/1gAAAJQBAAALAAAAX3JlbHMvLnJl bHOkkMFqwzAMhu+DvYPRfXGawxijTi+j0GvpHsDYimMaW0Yy2fr2M4PBMnrbUb/Q94l/f/hMi1qR JVI2sOt6UJgd+ZiDgffL8ekFlFSbvV0oo4EbChzGx4f9GRdb25HMsYhqlCwG5lrLq9biZkxWOiqY 22YiTra2kYMu1l1tQD30/bPm3wwYN0x18gb45AdQl1tp5j/sFB2T0FQ7R0nTNEV3j6o9feQzro1i OWA14Fm+Q8a1a8+Bvu/d/dMb2JY5uiPbhG/ktn4cqGU/er3pcvwCAAD//wMAUEsDBBQABgAIAAAA IQBdMWNFJQMAAMAHAAAOAAAAZHJzL2Uyb0RvYy54bWy0VW1v0zAQ/o7Ef7D8neWlSV+ipdPo1glp wMTgB7iO8yIcO9hu0/HrOTtp0m5FiCHyIbHju/Pdc89jX17ta452TOlKihQHFz5GTFCZVaJI8bev 63dzjLQhIiNcCpbiJ6bx1fLtm8u2SVgoS8kzphAEETppmxSXxjSJ52lasproC9kwAYu5VDUxMFWF lynSQvSae6HvT71WqqxRkjKt4e9Nt4iXLn6eM2o+57lmBvEUQ27GvZV7b+zbW16SpFCkKSvap0Fe kUVNKgGbDqFuiCFoq6oXoeqKKqllbi6orD2Z5xVlrgaoJvCfVXOn5LZxtRRJWzQDTADtM5xeHZZ+ 2t2p5rF5UIBE2xSAhZvZWva5qu0XskR7B9nTABnbG0ThZzifBpMAkKWwFs4Wkd9jSksA/oUbLW+P HSezwXE2n9pmeIdtvZNk2gbooUcE9L8h8FiShjlgdQIIPChUZcDeeWxrmU6gHEFqYOtqSzIlUcaQ gYIlCm2KNhdwspghs38vAYXA9V4395J+10jIVUlEwa6Vkm3JSAbZBq64I9cujrZBNu1HmcFuZGuk C3QW+MliFjuISDKCH8XRJO4xBOgh82MMSdIobe6YrJEdpFiBHtwOZHevTWd6MLGd1pJX2bri3E1U sVlxhXYEtLN2Tx/9xIwL1KZ4EYexiyyk9YfQJKkrA9rmVZ3iuW8f604Si8ityNzYkIp3Y2g8F9B/ C5FFpcPH7Df7rjcT62wXNzJ7AtCU7LQMZw8MSql+YtSCjlOsf2yJYhjxDwKAXwRRZIXvJlE8C2Gi jlc2xytEUAiVYoNRN1wZd1g4PJpraNC6criNmfQ5Azu7/P4/TePpPJpHwRTE09MUjlZqJIBiPwjk 2GMFNF2JXtoHWA8CG3QdxAs/xOicto/o9Qdm8UpYQZHkN8yyvX3OL3vGs4FhZt9p5MTqPCu0eeLM xuPiC8uBH6MET2MSSpkwh7jO2rrlwNDB0XdpuwtnTObUsbe3rszdKX/jPHi4naUwg3NdCanO7T5C kXf2B110dY/cgzY7wTjyuRMTrgn4d3IPHc+d/XjxLn8BAAD//wMAUEsDBBQABgAIAAAAIQBsafK3 4gAAAAwBAAAPAAAAZHJzL2Rvd25yZXYueG1sTI/BTsMwEETvSPyDtUjcqG2aBhriVFUFnCokWiTE zY23SdR4HcVukv497gmOOzuaeZOvJtuyAXvfOFIgZwIYUulMQ5WCr/3bwzMwHzQZ3TpCBRf0sCpu b3KdGTfSJw67ULEYQj7TCuoQuoxzX9ZotZ+5Din+jq63OsSzr7jp9RjDbcsfhUi51Q3Fhlp3uKmx PO3OVsH7qMf1XL4O29Nxc/nZLz6+txKVur+b1i/AAk7hzwxX/IgORWQ6uDMZz1oFqZxH9KAgEU9L YFeHSJME2CFKC7kEXuT8/4jiFwAA//8DAFBLAQItABQABgAIAAAAIQC2gziS/gAAAOEBAAATAAAA AAAAAAAAAAAAAAAAAABbQ29udGVudF9UeXBlc10ueG1sUEsBAi0AFAAGAAgAAAAhADj9If/WAAAA lAEAAAsAAAAAAAAAAAAAAAAALwEAAF9yZWxzLy5yZWxzUEsBAi0AFAAGAAgAAAAhAF0xY0UlAwAA wAcAAA4AAAAAAAAAAAAAAAAALgIAAGRycy9lMm9Eb2MueG1sUEsBAi0AFAAGAAgAAAAhAGxp8rfi AAAADAEAAA8AAAAAAAAAAAAAAAAAfwUAAGRycy9kb3ducmV2LnhtbFBLBQYAAAAABAAEAPMAAACO BgAAAAA= ">
-                <v:shape id="Cuadro de texto 2" o:spid="_x0000_s1054" type="#_x0000_t202" style="position:absolute;top:397;width:28454;height:2400;visibility:visible;mso-wrap-style:square;v-text-anchor:top" o:gfxdata="UEsDBBQABgAIAAAAIQDb4fbL7gAAAIUBAAATAAAAW0NvbnRlbnRfVHlwZXNdLnhtbHyQz07DMAyH 70i8Q+QralM4IITa7kDhCAiNB7ASt43WOlEcyvb2pNu4IODoPz9/n1xv9vOkForiPDdwXVagiI23 jocG3rdPxR0oScgWJ8/UwIEENu3lRb09BBKV0ywNjCmFe63FjDSjlD4Q50nv44wpl3HQAc0OB9I3 VXWrjedEnIq03oC27qjHjympx31un0wiTQLq4bS4shrAECZnMGVTvbD9QSnOhDInjzsyuiBXWQP0 r4R18jfgnHvJr4nOknrFmJ5xzhraRtHWf3Kkpfz/yGo5S+H73hkquyhdjr3R8m2lj09svwAAAP// AwBQSwMEFAAGAAgAAAAhAFr0LFu/AAAAFQEAAAsAAABfcmVscy8ucmVsc2zPwWrDMAwG4Ptg72B0 X5TuUMaI01uh19I+gLGVxCy2jGSy9e1nemrHjpL4P0nD4SetZiPRyNnCruvBUPYcYp4tXC/Htw8w Wl0ObuVMFm6kcBhfX4Yzra62kC6xqGlKVgtLreUTUf1CyWnHhXKbTCzJ1VbKjMX5LzcTvvf9HuXR gPHJNKdgQU5hB+ZyK23zHztFL6w81c5zQp6m6P9TMfB3PtPWFCczVQtB9N4U2rp2HOA44NMz4y8A AAD//wMAUEsDBBQABgAIAAAAIQCNYJnEywAAAOMAAAAPAAAAZHJzL2Rvd25yZXYueG1sRI9Pa8Mw DMXvg30Ho8Fuq5OVhpLVLaUwGKOH9c+hRxFrcZpYTmO3zb79dBjsKOm999NbrEbfqRsNsQlsIJ9k oIirYBuuDRwP7y9zUDEhW+wCk4EfirBaPj4ssLThzju67VOtJIRjiQZcSn2pdawceYyT0BPL7TsM HpOMQ63tgHcJ951+zbJCe2xYCA572jiq2v3VC2Qbq+suXM75ttUn1xY4+3Kfxjw/jes3UInG9C/+ c39YeX8+y6d5VkylhXSSBejlLwAAAP//AwBQSwECLQAUAAYACAAAACEA2+H2y+4AAACFAQAAEwAA AAAAAAAAAAAAAAAAAAAAW0NvbnRlbnRfVHlwZXNdLnhtbFBLAQItABQABgAIAAAAIQBa9CxbvwAA ABUBAAALAAAAAAAAAAAAAAAAAB8BAABfcmVscy8ucmVsc1BLAQItABQABgAIAAAAIQCNYJnEywAA AOMAAAAPAAAAAAAAAAAAAAAAAAcCAABkcnMvZG93bnJldi54bWxQSwUGAAAAAAMAAwC3AAAA/wIA AAAA " stroked="f">
+              <v:group w14:anchorId="71397554" id="_x0000_s1053" style="position:absolute;left:0;text-align:left;margin-left:306.9pt;margin-top:203.95pt;width:225.3pt;height:22pt;z-index:487623680;mso-position-horizontal-relative:page;mso-position-vertical-relative:text;mso-height-relative:margin" coordsize="28613,2797" o:gfxdata="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">
+                <v:shape id="Cuadro de texto 2" o:spid="_x0000_s1054" type="#_x0000_t202" style="position:absolute;top:397;width:28454;height:2400;visibility:visible;mso-wrap-style:square;v-text-anchor:top" o:gfxdata="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" stroked="f">
                   <v:textbox style="mso-fit-shape-to-text:t">
                     <w:txbxContent>
                       <w:p>
@@ -22339,7 +22339,7 @@
                     </w:txbxContent>
                   </v:textbox>
                 </v:shape>
-                <v:line id="Conector recto 10" o:spid="_x0000_s1055" style="position:absolute;visibility:visible;mso-wrap-style:square" from="159,0" to="28613,0" o:connectortype="straight" o:gfxdata="UEsDBBQABgAIAAAAIQDb4fbL7gAAAIUBAAATAAAAW0NvbnRlbnRfVHlwZXNdLnhtbHyQz07DMAyH 70i8Q+QralM4IITa7kDhCAiNB7ASt43WOlEcyvb2pNu4IODoPz9/n1xv9vOkForiPDdwXVagiI23 jocG3rdPxR0oScgWJ8/UwIEENu3lRb09BBKV0ywNjCmFe63FjDSjlD4Q50nv44wpl3HQAc0OB9I3 VXWrjedEnIq03oC27qjHjympx31un0wiTQLq4bS4shrAECZnMGVTvbD9QSnOhDInjzsyuiBXWQP0 r4R18jfgnHvJr4nOknrFmJ5xzhraRtHWf3Kkpfz/yGo5S+H73hkquyhdjr3R8m2lj09svwAAAP// AwBQSwMEFAAGAAgAAAAhAFr0LFu/AAAAFQEAAAsAAABfcmVscy8ucmVsc2zPwWrDMAwG4Ptg72B0 X5TuUMaI01uh19I+gLGVxCy2jGSy9e1nemrHjpL4P0nD4SetZiPRyNnCruvBUPYcYp4tXC/Htw8w Wl0ObuVMFm6kcBhfX4Yzra62kC6xqGlKVgtLreUTUf1CyWnHhXKbTCzJ1VbKjMX5LzcTvvf9HuXR gPHJNKdgQU5hB+ZyK23zHztFL6w81c5zQp6m6P9TMfB3PtPWFCczVQtB9N4U2rp2HOA44NMz4y8A AAD//wMAUEsDBBQABgAIAAAAIQDoQgS4yQAAAOMAAAAPAAAAZHJzL2Rvd25yZXYueG1sRE9LS8NA EL4L/Q/LFLzZTUqbhLTbEgoFHyer0uuQHZPY7GzYXdPor3cFweN879nuJ9OLkZzvLCtIFwkI4trq jhsFry/HuwKED8gae8uk4Is87Hezmy2W2l75mcZTaEQMYV+igjaEoZTS1y0Z9As7EEfu3TqDIZ6u kdrhNYabXi6TJJMGO44NLQ50aKm+nD6NgqJ+/HBVXj2k67ch/x6XT9nxnCt1O5+qDYhAU/gX/7nv dZy/zopVsUqzHH5/igDI3Q8AAAD//wMAUEsBAi0AFAAGAAgAAAAhANvh9svuAAAAhQEAABMAAAAA AAAAAAAAAAAAAAAAAFtDb250ZW50X1R5cGVzXS54bWxQSwECLQAUAAYACAAAACEAWvQsW78AAAAV AQAACwAAAAAAAAAAAAAAAAAfAQAAX3JlbHMvLnJlbHNQSwECLQAUAAYACAAAACEA6EIEuMkAAADj AAAADwAAAAAAAAAAAAAAAAAHAgAAZHJzL2Rvd25yZXYueG1sUEsFBgAAAAADAAMAtwAAAP0CAAAA AA== " strokecolor="black [3213]"/>
+                <v:line id="Conector recto 10" o:spid="_x0000_s1055" style="position:absolute;visibility:visible;mso-wrap-style:square" from="159,0" to="28613,0" o:connectortype="straight" o:gfxdata="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" strokecolor="black [3213]"/>
                 <w10:wrap anchorx="page"/>
               </v:group>
             </w:pict>
@@ -23374,25 +23374,7 @@
           <w:sz w:val="18"/>
           <w:szCs w:val="18"/>
         </w:rPr>
-        <w:t>_</w:t>
-      </w:r>
-      <w:proofErr w:type="gramStart"/>
-      <w:r>
-        <w:rPr>
-          <w:rFonts w:asciiTheme="minorHAnsi" w:hAnsiTheme="minorHAnsi" w:cstheme="minorHAnsi"/>
-          <w:sz w:val="18"/>
-          <w:szCs w:val="18"/>
-        </w:rPr>
-        <w:t>DECIMAL}/</w:t>
-      </w:r>
-      <w:proofErr w:type="gramEnd"/>
-      <w:r>
-        <w:rPr>
-          <w:rFonts w:asciiTheme="minorHAnsi" w:hAnsiTheme="minorHAnsi" w:cstheme="minorHAnsi"/>
-          <w:sz w:val="18"/>
-          <w:szCs w:val="18"/>
-        </w:rPr>
-        <w:t>100 soles).</w:t>
+        <w:t>_DECIMAL}/100 soles).</w:t>
       </w:r>
     </w:p>
     <w:p>
@@ -23402,8 +23384,8 @@
         <w:jc w:val="both"/>
         <w:rPr>
           <w:rFonts w:asciiTheme="minorHAnsi" w:hAnsiTheme="minorHAnsi" w:cstheme="minorHAnsi"/>
-          <w:sz w:val="16"/>
-          <w:szCs w:val="16"/>
+          <w:sz w:val="18"/>
+          <w:szCs w:val="18"/>
         </w:rPr>
       </w:pPr>
       <w:r>
@@ -23431,8 +23413,8 @@
         <w:jc w:val="both"/>
         <w:rPr>
           <w:rFonts w:asciiTheme="minorHAnsi" w:hAnsiTheme="minorHAnsi" w:cstheme="minorHAnsi"/>
-          <w:sz w:val="16"/>
-          <w:szCs w:val="16"/>
+          <w:sz w:val="18"/>
+          <w:szCs w:val="18"/>
         </w:rPr>
       </w:pPr>
       <w:r>
@@ -23450,7 +23432,14 @@
           <w:szCs w:val="18"/>
         </w:rPr>
         <w:tab/>
-        <w:t>El descuento será aplicado en la planilla correspondiente al mes en que se perciba la gratificación legal, con el fin de reembolsar el monto adelantado.</w:t>
+      </w:r>
+      <w:r>
+        <w:rPr>
+          <w:rFonts w:asciiTheme="minorHAnsi" w:hAnsiTheme="minorHAnsi" w:cstheme="minorHAnsi"/>
+          <w:sz w:val="18"/>
+          <w:szCs w:val="18"/>
+        </w:rPr>
+        <w:t>El adelanto de gratificación otorgado por SMART CASH S.A.C. estará sujeto a los intereses y/o comisiones que correspondan a dicha operación, conforme a las condiciones económicas previamente informadas y aceptadas. El importe correspondiente a dichos conceptos asciende a S/ {GRAT_INTERES} por concepto de intereses y S/ {GRAT_COMISION} por concepto de comisión. En consecuencia, el importe total a reembolsar por el adelanto de gratificación asciende a S/ {GRAT_TOTAL}, de acuerdo con las condiciones pactadas. Autorizo que dichos importes sean considerados en la liquidación de la operación y en los descuentos que correspondan, según lo expresamente acordado.</w:t>
       </w:r>
     </w:p>
     <w:p>
@@ -23470,7 +23459,15 @@
           <w:sz w:val="18"/>
           <w:szCs w:val="18"/>
         </w:rPr>
-        <w:t>4.</w:t>
+        <w:t>4</w:t>
+      </w:r>
+      <w:r>
+        <w:rPr>
+          <w:rFonts w:asciiTheme="minorHAnsi" w:hAnsiTheme="minorHAnsi" w:cstheme="minorHAnsi"/>
+          <w:sz w:val="18"/>
+          <w:szCs w:val="18"/>
+        </w:rPr>
+        <w:t>.</w:t>
       </w:r>
       <w:r>
         <w:rPr>
@@ -23479,25 +23476,7 @@
           <w:szCs w:val="18"/>
         </w:rPr>
         <w:tab/>
-        <w:t>Autorizo expresamente a la empresa {EMPRESA} (</w:t>
-      </w:r>
-      <w:r>
-        <w:rPr>
-          <w:rFonts w:asciiTheme="minorHAnsi" w:hAnsiTheme="minorHAnsi" w:cstheme="minorHAnsi"/>
-          <w:i/>
-          <w:iCs/>
-          <w:sz w:val="18"/>
-          <w:szCs w:val="18"/>
-        </w:rPr>
-        <w:t>Razón social del empleador</w:t>
-      </w:r>
-      <w:r>
-        <w:rPr>
-          <w:rFonts w:asciiTheme="minorHAnsi" w:hAnsiTheme="minorHAnsi" w:cstheme="minorHAnsi"/>
-          <w:sz w:val="18"/>
-          <w:szCs w:val="18"/>
-        </w:rPr>
-        <w:t>) para transferir el importe descontado a favor de SMART CASH S.A.C., conforme a los términos del convenio vigente entre ambas empresas.</w:t>
+        <w:t>El descuento será aplicado en la planilla correspondiente al mes en que se perciba la gratificación legal, con el fin de reembolsar el monto adelantado.</w:t>
       </w:r>
     </w:p>
     <w:p>
@@ -23517,7 +23496,15 @@
           <w:sz w:val="18"/>
           <w:szCs w:val="18"/>
         </w:rPr>
-        <w:t>5.</w:t>
+        <w:t>5</w:t>
+      </w:r>
+      <w:r>
+        <w:rPr>
+          <w:rFonts w:asciiTheme="minorHAnsi" w:hAnsiTheme="minorHAnsi" w:cstheme="minorHAnsi"/>
+          <w:sz w:val="18"/>
+          <w:szCs w:val="18"/>
+        </w:rPr>
+        <w:t>.</w:t>
       </w:r>
       <w:r>
         <w:rPr>
@@ -23526,7 +23513,25 @@
           <w:szCs w:val="18"/>
         </w:rPr>
         <w:tab/>
-        <w:t>En caso de cese laboral, renuncia o cualquier forma de terminación del vínculo laboral antes de efectuarse el descuento respectivo, autorizo a mi empleador a descontar de mi liquidación de beneficios sociales el monto pendiente de pago derivado del adelanto de gratificación legal recibido.</w:t>
+        <w:t>Autorizo expresamente a la empresa {EMPRESA} (</w:t>
+      </w:r>
+      <w:r>
+        <w:rPr>
+          <w:rFonts w:asciiTheme="minorHAnsi" w:hAnsiTheme="minorHAnsi" w:cstheme="minorHAnsi"/>
+          <w:i/>
+          <w:iCs/>
+          <w:sz w:val="18"/>
+          <w:szCs w:val="18"/>
+        </w:rPr>
+        <w:t>Razón social del empleador</w:t>
+      </w:r>
+      <w:r>
+        <w:rPr>
+          <w:rFonts w:asciiTheme="minorHAnsi" w:hAnsiTheme="minorHAnsi" w:cstheme="minorHAnsi"/>
+          <w:sz w:val="18"/>
+          <w:szCs w:val="18"/>
+        </w:rPr>
+        <w:t>) para transferir el importe descontado a favor de SMART CASH S.A.C., conforme a los términos del convenio vigente entre ambas empresas.</w:t>
       </w:r>
     </w:p>
     <w:p>
@@ -23546,7 +23551,15 @@
           <w:sz w:val="18"/>
           <w:szCs w:val="18"/>
         </w:rPr>
-        <w:t>6.</w:t>
+        <w:t>6</w:t>
+      </w:r>
+      <w:r>
+        <w:rPr>
+          <w:rFonts w:asciiTheme="minorHAnsi" w:hAnsiTheme="minorHAnsi" w:cstheme="minorHAnsi"/>
+          <w:sz w:val="18"/>
+          <w:szCs w:val="18"/>
+        </w:rPr>
+        <w:t>.</w:t>
       </w:r>
       <w:r>
         <w:rPr>
@@ -23555,7 +23568,7 @@
           <w:szCs w:val="18"/>
         </w:rPr>
         <w:tab/>
-        <w:t>Declaro que esta autorización se otorga libremente y sin coacción alguna, y con pleno conocimiento de que el adelanto recibido será compensado con mi gratificación legal o, en su defecto, con los beneficios sociales que me correspondan al término de la relación laboral.</w:t>
+        <w:t>En caso de cese laboral, renuncia o cualquier forma de terminación del vínculo laboral antes de efectuarse el descuento respectivo, autorizo a mi empleador a descontar de mi liquidación de beneficios sociales el monto pendiente de pago derivado del adelanto de gratificación legal recibido.</w:t>
       </w:r>
     </w:p>
     <w:p>
@@ -23575,7 +23588,52 @@
           <w:sz w:val="18"/>
           <w:szCs w:val="18"/>
         </w:rPr>
-        <w:t>7.</w:t>
+        <w:t>7</w:t>
+      </w:r>
+      <w:r>
+        <w:rPr>
+          <w:rFonts w:asciiTheme="minorHAnsi" w:hAnsiTheme="minorHAnsi" w:cstheme="minorHAnsi"/>
+          <w:sz w:val="18"/>
+          <w:szCs w:val="18"/>
+        </w:rPr>
+        <w:t>.</w:t>
+      </w:r>
+      <w:r>
+        <w:rPr>
+          <w:rFonts w:asciiTheme="minorHAnsi" w:hAnsiTheme="minorHAnsi" w:cstheme="minorHAnsi"/>
+          <w:sz w:val="18"/>
+          <w:szCs w:val="18"/>
+        </w:rPr>
+        <w:tab/>
+        <w:t>Declaro que esta autorización se otorga libremente y sin coacción alguna, y con pleno conocimiento de que el adelanto recibido será compensado con mi gratificación legal o, en su defecto, con los beneficios sociales que me correspondan al término de la relación laboral.</w:t>
+      </w:r>
+    </w:p>
+    <w:p>
+      <w:pPr>
+        <w:spacing w:after="120"/>
+        <w:ind w:left="1134" w:right="567" w:hanging="567"/>
+        <w:jc w:val="both"/>
+        <w:rPr>
+          <w:rFonts w:asciiTheme="minorHAnsi" w:hAnsiTheme="minorHAnsi" w:cstheme="minorHAnsi"/>
+          <w:sz w:val="16"/>
+          <w:szCs w:val="16"/>
+        </w:rPr>
+      </w:pPr>
+      <w:r>
+        <w:rPr>
+          <w:rFonts w:asciiTheme="minorHAnsi" w:hAnsiTheme="minorHAnsi" w:cstheme="minorHAnsi"/>
+          <w:sz w:val="18"/>
+          <w:szCs w:val="18"/>
+        </w:rPr>
+        <w:t>8</w:t>
+      </w:r>
+      <w:r>
+        <w:rPr>
+          <w:rFonts w:asciiTheme="minorHAnsi" w:hAnsiTheme="minorHAnsi" w:cstheme="minorHAnsi"/>
+          <w:sz w:val="18"/>
+          <w:szCs w:val="18"/>
+        </w:rPr>
+        <w:t>.</w:t>
       </w:r>
       <w:r>
         <w:rPr>

</xml_diff>